<commit_message>
added new research proposal & added intro&objective in project report
</commit_message>
<xml_diff>
--- a/customer_churn_project/reports/Project Report.docx
+++ b/customer_churn_project/reports/Project Report.docx
@@ -25,7 +25,7 @@
                     <pic:cNvPicPr/>
                   </pic:nvPicPr>
                   <pic:blipFill>
-                    <a:blip r:embed="rId4"/>
+                    <a:blip r:embed="rId5"/>
                     <a:stretch>
                       <a:fillRect/>
                     </a:stretch>
@@ -182,7 +182,15 @@
         <w:ind w:left="515" w:right="78"/>
       </w:pPr>
       <w:r>
-        <w:t>Dr. D. Y. Patil Vidyapeeth, Centre For Online Learning, Pune</w:t>
+        <w:t xml:space="preserve">Dr. D. Y. Patil Vidyapeeth, Centre </w:t>
+      </w:r>
+      <w:proofErr w:type="gramStart"/>
+      <w:r>
+        <w:t>For</w:t>
+      </w:r>
+      <w:proofErr w:type="gramEnd"/>
+      <w:r>
+        <w:t xml:space="preserve"> Online Learning, Pune</w:t>
       </w:r>
     </w:p>
     <w:p>
@@ -262,12 +270,21 @@
         <w:ind w:left="515" w:hanging="10"/>
         <w:jc w:val="center"/>
       </w:pPr>
-      <w:r>
-        <w:rPr>
-          <w:rFonts w:ascii="Arial" w:eastAsia="Arial" w:hAnsi="Arial" w:cs="Arial"/>
-          <w:sz w:val="24"/>
-        </w:rPr>
-        <w:t>ERPID : 241114835</w:t>
+      <w:proofErr w:type="gramStart"/>
+      <w:r>
+        <w:rPr>
+          <w:rFonts w:ascii="Arial" w:eastAsia="Arial" w:hAnsi="Arial" w:cs="Arial"/>
+          <w:sz w:val="24"/>
+        </w:rPr>
+        <w:t>ERPID :</w:t>
+      </w:r>
+      <w:proofErr w:type="gramEnd"/>
+      <w:r>
+        <w:rPr>
+          <w:rFonts w:ascii="Arial" w:eastAsia="Arial" w:hAnsi="Arial" w:cs="Arial"/>
+          <w:sz w:val="24"/>
+        </w:rPr>
+        <w:t xml:space="preserve"> 241114835</w:t>
       </w:r>
     </w:p>
     <w:p>
@@ -276,12 +293,21 @@
         <w:ind w:left="515" w:hanging="10"/>
         <w:jc w:val="center"/>
       </w:pPr>
-      <w:r>
-        <w:rPr>
-          <w:rFonts w:ascii="Arial" w:eastAsia="Arial" w:hAnsi="Arial" w:cs="Arial"/>
-          <w:sz w:val="24"/>
-        </w:rPr>
-        <w:t>PRN : 240502007175</w:t>
+      <w:proofErr w:type="gramStart"/>
+      <w:r>
+        <w:rPr>
+          <w:rFonts w:ascii="Arial" w:eastAsia="Arial" w:hAnsi="Arial" w:cs="Arial"/>
+          <w:sz w:val="24"/>
+        </w:rPr>
+        <w:t>PRN :</w:t>
+      </w:r>
+      <w:proofErr w:type="gramEnd"/>
+      <w:r>
+        <w:rPr>
+          <w:rFonts w:ascii="Arial" w:eastAsia="Arial" w:hAnsi="Arial" w:cs="Arial"/>
+          <w:sz w:val="24"/>
+        </w:rPr>
+        <w:t xml:space="preserve"> 240502007175</w:t>
       </w:r>
     </w:p>
     <w:p>
@@ -310,8 +336,17 @@
           <w:rFonts w:ascii="Arial" w:eastAsia="Arial" w:hAnsi="Arial" w:cs="Arial"/>
           <w:sz w:val="24"/>
         </w:rPr>
-        <w:t>Professor Dr. Mahantesh M. Kodabagi</w:t>
-      </w:r>
+        <w:t xml:space="preserve">Professor Dr. Mahantesh M. </w:t>
+      </w:r>
+      <w:proofErr w:type="spellStart"/>
+      <w:r>
+        <w:rPr>
+          <w:rFonts w:ascii="Arial" w:eastAsia="Arial" w:hAnsi="Arial" w:cs="Arial"/>
+          <w:sz w:val="24"/>
+        </w:rPr>
+        <w:t>Kodabagi</w:t>
+      </w:r>
+      <w:proofErr w:type="spellEnd"/>
     </w:p>
     <w:p>
       <w:pPr>
@@ -337,7 +372,23 @@
           <w:rFonts w:ascii="Arial" w:eastAsia="Arial" w:hAnsi="Arial" w:cs="Arial"/>
           <w:sz w:val="24"/>
         </w:rPr>
-        <w:t>Dr. D. Y. Patil Vidyapeeth, Centre For Online Learning</w:t>
+        <w:t xml:space="preserve">Dr. D. Y. Patil Vidyapeeth, Centre </w:t>
+      </w:r>
+      <w:proofErr w:type="gramStart"/>
+      <w:r>
+        <w:rPr>
+          <w:rFonts w:ascii="Arial" w:eastAsia="Arial" w:hAnsi="Arial" w:cs="Arial"/>
+          <w:sz w:val="24"/>
+        </w:rPr>
+        <w:t>For</w:t>
+      </w:r>
+      <w:proofErr w:type="gramEnd"/>
+      <w:r>
+        <w:rPr>
+          <w:rFonts w:ascii="Arial" w:eastAsia="Arial" w:hAnsi="Arial" w:cs="Arial"/>
+          <w:sz w:val="24"/>
+        </w:rPr>
+        <w:t xml:space="preserve"> Online Learning</w:t>
       </w:r>
     </w:p>
     <w:p>
@@ -417,7 +468,7 @@
                     <pic:cNvPicPr/>
                   </pic:nvPicPr>
                   <pic:blipFill>
-                    <a:blip r:embed="rId4"/>
+                    <a:blip r:embed="rId5"/>
                     <a:stretch>
                       <a:fillRect/>
                     </a:stretch>
@@ -671,7 +722,7 @@
                     <pic:cNvPicPr/>
                   </pic:nvPicPr>
                   <pic:blipFill>
-                    <a:blip r:embed="rId4"/>
+                    <a:blip r:embed="rId5"/>
                     <a:stretch>
                       <a:fillRect/>
                     </a:stretch>
@@ -881,8 +932,18 @@
           <w:b/>
           <w:sz w:val="24"/>
         </w:rPr>
-        <w:t>Dr. Mahantesh M. Kodabagi</w:t>
-      </w:r>
+        <w:t xml:space="preserve">Dr. Mahantesh M. </w:t>
+      </w:r>
+      <w:proofErr w:type="spellStart"/>
+      <w:r>
+        <w:rPr>
+          <w:rFonts w:ascii="Arial" w:eastAsia="Arial" w:hAnsi="Arial" w:cs="Arial"/>
+          <w:b/>
+          <w:sz w:val="24"/>
+        </w:rPr>
+        <w:t>Kodabagi</w:t>
+      </w:r>
+      <w:proofErr w:type="spellEnd"/>
     </w:p>
     <w:p>
       <w:pPr>
@@ -980,7 +1041,7 @@
                     <pic:cNvPicPr/>
                   </pic:nvPicPr>
                   <pic:blipFill>
-                    <a:blip r:embed="rId4"/>
+                    <a:blip r:embed="rId5"/>
                     <a:stretch>
                       <a:fillRect/>
                     </a:stretch>
@@ -1104,8 +1165,17 @@
           <w:rFonts w:ascii="Arial" w:eastAsia="Arial" w:hAnsi="Arial" w:cs="Arial"/>
           <w:b/>
         </w:rPr>
-        <w:t>Dr. Mahantesh M. Kodabagi</w:t>
-      </w:r>
+        <w:t xml:space="preserve">Dr. Mahantesh M. </w:t>
+      </w:r>
+      <w:proofErr w:type="spellStart"/>
+      <w:r>
+        <w:rPr>
+          <w:rFonts w:ascii="Arial" w:eastAsia="Arial" w:hAnsi="Arial" w:cs="Arial"/>
+          <w:b/>
+        </w:rPr>
+        <w:t>Kodabagi</w:t>
+      </w:r>
+      <w:proofErr w:type="spellEnd"/>
       <w:r>
         <w:t>, Dr. D. Y. Patil Vidyapeeth, Centre for Online Learning, Pune. Without his/her invaluable guidance, constant motivation, and insightful suggestions, the completion of this project would not have been possible. I am sincerely grateful for the knowledge and research orientation imparted to me under his/her mentorship.</w:t>
       </w:r>
@@ -1209,6 +1279,9 @@
         <w:spacing w:after="420" w:line="264" w:lineRule="auto"/>
         <w:ind w:left="515" w:hanging="10"/>
         <w:jc w:val="center"/>
+        <w:rPr>
+          <w:rFonts w:ascii="Times New Roman" w:hAnsi="Times New Roman" w:cs="Times New Roman"/>
+        </w:rPr>
       </w:pPr>
     </w:p>
     <w:p>
@@ -1217,6 +1290,7 @@
         <w:ind w:left="515" w:hanging="10"/>
         <w:jc w:val="center"/>
         <w:rPr>
+          <w:rFonts w:ascii="Times New Roman" w:hAnsi="Times New Roman" w:cs="Times New Roman"/>
           <w:b/>
           <w:bCs/>
           <w:sz w:val="32"/>
@@ -1225,6 +1299,7 @@
       </w:pPr>
       <w:r>
         <w:rPr>
+          <w:rFonts w:ascii="Times New Roman" w:hAnsi="Times New Roman" w:cs="Times New Roman"/>
           <w:b/>
           <w:bCs/>
           <w:sz w:val="32"/>
@@ -1241,9 +1316,9 @@
         <w:tblLook w:val="04A0" w:firstRow="1" w:lastRow="0" w:firstColumn="1" w:lastColumn="0" w:noHBand="0" w:noVBand="1"/>
       </w:tblPr>
       <w:tblGrid>
-        <w:gridCol w:w="2968"/>
-        <w:gridCol w:w="2969"/>
-        <w:gridCol w:w="2933"/>
+        <w:gridCol w:w="2920"/>
+        <w:gridCol w:w="3085"/>
+        <w:gridCol w:w="2865"/>
       </w:tblGrid>
       <w:tr>
         <w:trPr>
@@ -1258,6 +1333,7 @@
               <w:spacing w:after="420" w:line="240" w:lineRule="auto"/>
               <w:jc w:val="center"/>
               <w:rPr>
+                <w:rFonts w:ascii="Times New Roman" w:hAnsi="Times New Roman" w:cs="Times New Roman"/>
                 <w:b/>
                 <w:bCs/>
                 <w:sz w:val="32"/>
@@ -1266,6 +1342,7 @@
             </w:pPr>
             <w:r>
               <w:rPr>
+                <w:rFonts w:ascii="Times New Roman" w:hAnsi="Times New Roman" w:cs="Times New Roman"/>
                 <w:b/>
                 <w:bCs/>
                 <w:sz w:val="32"/>
@@ -1284,6 +1361,7 @@
               <w:spacing w:after="420" w:line="240" w:lineRule="auto"/>
               <w:jc w:val="center"/>
               <w:rPr>
+                <w:rFonts w:ascii="Times New Roman" w:hAnsi="Times New Roman" w:cs="Times New Roman"/>
                 <w:b/>
                 <w:bCs/>
                 <w:sz w:val="32"/>
@@ -1292,6 +1370,7 @@
             </w:pPr>
             <w:r>
               <w:rPr>
+                <w:rFonts w:ascii="Times New Roman" w:hAnsi="Times New Roman" w:cs="Times New Roman"/>
                 <w:b/>
                 <w:bCs/>
                 <w:sz w:val="32"/>
@@ -1310,6 +1389,7 @@
               <w:spacing w:after="420" w:line="240" w:lineRule="auto"/>
               <w:jc w:val="center"/>
               <w:rPr>
+                <w:rFonts w:ascii="Times New Roman" w:hAnsi="Times New Roman" w:cs="Times New Roman"/>
                 <w:b/>
                 <w:bCs/>
                 <w:sz w:val="32"/>
@@ -1318,6 +1398,7 @@
             </w:pPr>
             <w:r>
               <w:rPr>
+                <w:rFonts w:ascii="Times New Roman" w:hAnsi="Times New Roman" w:cs="Times New Roman"/>
                 <w:b/>
                 <w:bCs/>
                 <w:sz w:val="32"/>
@@ -1338,20 +1419,14 @@
           </w:tcPr>
           <w:p>
             <w:pPr>
-              <w:spacing w:after="0" w:line="240" w:lineRule="auto"/>
+              <w:spacing w:line="240" w:lineRule="auto"/>
               <w:jc w:val="center"/>
               <w:rPr>
+                <w:rFonts w:ascii="Times New Roman" w:hAnsi="Times New Roman" w:cs="Times New Roman"/>
                 <w:sz w:val="24"/>
                 <w:szCs w:val="24"/>
               </w:rPr>
             </w:pPr>
-            <w:r>
-              <w:rPr>
-                <w:sz w:val="24"/>
-                <w:szCs w:val="24"/>
-              </w:rPr>
-              <w:t>1</w:t>
-            </w:r>
           </w:p>
         </w:tc>
         <w:tc>
@@ -1360,19 +1435,21 @@
           </w:tcPr>
           <w:p>
             <w:pPr>
-              <w:spacing w:after="0" w:line="240" w:lineRule="auto"/>
+              <w:spacing w:line="240" w:lineRule="auto"/>
               <w:jc w:val="center"/>
               <w:rPr>
+                <w:rFonts w:ascii="Times New Roman" w:hAnsi="Times New Roman" w:cs="Times New Roman"/>
                 <w:sz w:val="24"/>
                 <w:szCs w:val="24"/>
               </w:rPr>
             </w:pPr>
             <w:r>
               <w:rPr>
-                <w:sz w:val="24"/>
-                <w:szCs w:val="24"/>
-              </w:rPr>
-              <w:t>show</w:t>
+                <w:rFonts w:ascii="Times New Roman" w:hAnsi="Times New Roman" w:cs="Times New Roman"/>
+                <w:sz w:val="24"/>
+                <w:szCs w:val="24"/>
+              </w:rPr>
+              <w:t>DECLARATION BY STUDENT</w:t>
             </w:r>
           </w:p>
         </w:tc>
@@ -1382,24 +1459,29 @@
           </w:tcPr>
           <w:p>
             <w:pPr>
-              <w:spacing w:after="0" w:line="240" w:lineRule="auto"/>
+              <w:spacing w:line="240" w:lineRule="auto"/>
               <w:jc w:val="center"/>
               <w:rPr>
+                <w:rFonts w:ascii="Times New Roman" w:hAnsi="Times New Roman" w:cs="Times New Roman"/>
                 <w:sz w:val="24"/>
                 <w:szCs w:val="24"/>
               </w:rPr>
             </w:pPr>
             <w:r>
               <w:rPr>
-                <w:sz w:val="24"/>
-                <w:szCs w:val="24"/>
-              </w:rPr>
-              <w:t>year</w:t>
+                <w:rFonts w:ascii="Times New Roman" w:hAnsi="Times New Roman" w:cs="Times New Roman"/>
+                <w:sz w:val="24"/>
+                <w:szCs w:val="24"/>
+              </w:rPr>
+              <w:t>I</w:t>
             </w:r>
           </w:p>
         </w:tc>
       </w:tr>
       <w:tr>
+        <w:trPr>
+          <w:trHeight w:val="288"/>
+        </w:trPr>
         <w:tc>
           <w:tcPr>
             <w:tcW w:w="3128" w:type="dxa"/>
@@ -1409,6 +1491,76 @@
               <w:spacing w:after="420" w:line="240" w:lineRule="auto"/>
               <w:jc w:val="center"/>
               <w:rPr>
+                <w:rFonts w:ascii="Times New Roman" w:hAnsi="Times New Roman" w:cs="Times New Roman"/>
+                <w:sz w:val="24"/>
+                <w:szCs w:val="24"/>
+              </w:rPr>
+            </w:pPr>
+          </w:p>
+        </w:tc>
+        <w:tc>
+          <w:tcPr>
+            <w:tcW w:w="3128" w:type="dxa"/>
+          </w:tcPr>
+          <w:p>
+            <w:pPr>
+              <w:spacing w:line="240" w:lineRule="auto"/>
+              <w:jc w:val="center"/>
+              <w:rPr>
+                <w:rFonts w:ascii="Times New Roman" w:hAnsi="Times New Roman" w:cs="Times New Roman"/>
+                <w:sz w:val="24"/>
+                <w:szCs w:val="24"/>
+              </w:rPr>
+            </w:pPr>
+            <w:r>
+              <w:rPr>
+                <w:rFonts w:ascii="Times New Roman" w:hAnsi="Times New Roman" w:cs="Times New Roman"/>
+                <w:sz w:val="24"/>
+                <w:szCs w:val="24"/>
+              </w:rPr>
+              <w:t>ACKNOWLEDGEMENT</w:t>
+            </w:r>
+          </w:p>
+        </w:tc>
+        <w:tc>
+          <w:tcPr>
+            <w:tcW w:w="3129" w:type="dxa"/>
+          </w:tcPr>
+          <w:p>
+            <w:pPr>
+              <w:spacing w:after="420" w:line="240" w:lineRule="auto"/>
+              <w:jc w:val="center"/>
+              <w:rPr>
+                <w:rFonts w:ascii="Times New Roman" w:hAnsi="Times New Roman" w:cs="Times New Roman"/>
+                <w:sz w:val="24"/>
+                <w:szCs w:val="24"/>
+              </w:rPr>
+            </w:pPr>
+            <w:r>
+              <w:rPr>
+                <w:rFonts w:ascii="Times New Roman" w:hAnsi="Times New Roman" w:cs="Times New Roman"/>
+                <w:sz w:val="24"/>
+                <w:szCs w:val="24"/>
+              </w:rPr>
+              <w:t>II</w:t>
+            </w:r>
+          </w:p>
+        </w:tc>
+      </w:tr>
+      <w:tr>
+        <w:trPr>
+          <w:trHeight w:val="288"/>
+        </w:trPr>
+        <w:tc>
+          <w:tcPr>
+            <w:tcW w:w="3128" w:type="dxa"/>
+          </w:tcPr>
+          <w:p>
+            <w:pPr>
+              <w:spacing w:after="420" w:line="240" w:lineRule="auto"/>
+              <w:jc w:val="center"/>
+              <w:rPr>
+                <w:rFonts w:ascii="Times New Roman" w:hAnsi="Times New Roman" w:cs="Times New Roman"/>
                 <w:sz w:val="24"/>
                 <w:szCs w:val="24"/>
               </w:rPr>
@@ -1424,10 +1576,19 @@
               <w:spacing w:after="420" w:line="240" w:lineRule="auto"/>
               <w:jc w:val="center"/>
               <w:rPr>
+                <w:rFonts w:ascii="Times New Roman" w:hAnsi="Times New Roman" w:cs="Times New Roman"/>
                 <w:sz w:val="24"/>
                 <w:szCs w:val="24"/>
               </w:rPr>
             </w:pPr>
+            <w:r>
+              <w:rPr>
+                <w:rFonts w:ascii="Times New Roman" w:hAnsi="Times New Roman" w:cs="Times New Roman"/>
+                <w:sz w:val="24"/>
+                <w:szCs w:val="24"/>
+              </w:rPr>
+              <w:t>CERTIFICATE BY THE GUIDE</w:t>
+            </w:r>
           </w:p>
         </w:tc>
         <w:tc>
@@ -1439,14 +1600,26 @@
               <w:spacing w:after="420" w:line="240" w:lineRule="auto"/>
               <w:jc w:val="center"/>
               <w:rPr>
+                <w:rFonts w:ascii="Times New Roman" w:hAnsi="Times New Roman" w:cs="Times New Roman"/>
                 <w:sz w:val="24"/>
                 <w:szCs w:val="24"/>
               </w:rPr>
             </w:pPr>
+            <w:r>
+              <w:rPr>
+                <w:rFonts w:ascii="Times New Roman" w:hAnsi="Times New Roman" w:cs="Times New Roman"/>
+                <w:sz w:val="24"/>
+                <w:szCs w:val="24"/>
+              </w:rPr>
+              <w:t>III</w:t>
+            </w:r>
           </w:p>
         </w:tc>
       </w:tr>
       <w:tr>
+        <w:trPr>
+          <w:trHeight w:val="288"/>
+        </w:trPr>
         <w:tc>
           <w:tcPr>
             <w:tcW w:w="3128" w:type="dxa"/>
@@ -1456,6 +1629,7 @@
               <w:spacing w:after="420" w:line="240" w:lineRule="auto"/>
               <w:jc w:val="center"/>
               <w:rPr>
+                <w:rFonts w:ascii="Times New Roman" w:hAnsi="Times New Roman" w:cs="Times New Roman"/>
                 <w:sz w:val="24"/>
                 <w:szCs w:val="24"/>
               </w:rPr>
@@ -1471,10 +1645,19 @@
               <w:spacing w:after="420" w:line="240" w:lineRule="auto"/>
               <w:jc w:val="center"/>
               <w:rPr>
+                <w:rFonts w:ascii="Times New Roman" w:hAnsi="Times New Roman" w:cs="Times New Roman"/>
                 <w:sz w:val="24"/>
                 <w:szCs w:val="24"/>
               </w:rPr>
             </w:pPr>
+            <w:r>
+              <w:rPr>
+                <w:rFonts w:ascii="Times New Roman" w:hAnsi="Times New Roman" w:cs="Times New Roman"/>
+                <w:sz w:val="24"/>
+                <w:szCs w:val="24"/>
+              </w:rPr>
+              <w:t>CERTIFICATE BY THE ORGANIZATION</w:t>
+            </w:r>
           </w:p>
         </w:tc>
         <w:tc>
@@ -1486,14 +1669,26 @@
               <w:spacing w:after="420" w:line="240" w:lineRule="auto"/>
               <w:jc w:val="center"/>
               <w:rPr>
+                <w:rFonts w:ascii="Times New Roman" w:hAnsi="Times New Roman" w:cs="Times New Roman"/>
                 <w:sz w:val="24"/>
                 <w:szCs w:val="24"/>
               </w:rPr>
             </w:pPr>
+            <w:r>
+              <w:rPr>
+                <w:rFonts w:ascii="Times New Roman" w:hAnsi="Times New Roman" w:cs="Times New Roman"/>
+                <w:sz w:val="24"/>
+                <w:szCs w:val="24"/>
+              </w:rPr>
+              <w:t>IV</w:t>
+            </w:r>
           </w:p>
         </w:tc>
       </w:tr>
       <w:tr>
+        <w:trPr>
+          <w:trHeight w:val="288"/>
+        </w:trPr>
         <w:tc>
           <w:tcPr>
             <w:tcW w:w="3128" w:type="dxa"/>
@@ -1503,6 +1698,7 @@
               <w:spacing w:after="420" w:line="240" w:lineRule="auto"/>
               <w:jc w:val="center"/>
               <w:rPr>
+                <w:rFonts w:ascii="Times New Roman" w:hAnsi="Times New Roman" w:cs="Times New Roman"/>
                 <w:sz w:val="24"/>
                 <w:szCs w:val="24"/>
               </w:rPr>
@@ -1518,10 +1714,19 @@
               <w:spacing w:after="420" w:line="240" w:lineRule="auto"/>
               <w:jc w:val="center"/>
               <w:rPr>
+                <w:rFonts w:ascii="Times New Roman" w:hAnsi="Times New Roman" w:cs="Times New Roman"/>
                 <w:sz w:val="24"/>
                 <w:szCs w:val="24"/>
               </w:rPr>
             </w:pPr>
+            <w:r>
+              <w:rPr>
+                <w:rFonts w:ascii="Times New Roman" w:hAnsi="Times New Roman" w:cs="Times New Roman"/>
+                <w:sz w:val="24"/>
+                <w:szCs w:val="24"/>
+              </w:rPr>
+              <w:t>TABLE OF CONTENTS</w:t>
+            </w:r>
           </w:p>
         </w:tc>
         <w:tc>
@@ -1533,14 +1738,26 @@
               <w:spacing w:after="420" w:line="240" w:lineRule="auto"/>
               <w:jc w:val="center"/>
               <w:rPr>
+                <w:rFonts w:ascii="Times New Roman" w:hAnsi="Times New Roman" w:cs="Times New Roman"/>
                 <w:sz w:val="24"/>
                 <w:szCs w:val="24"/>
               </w:rPr>
             </w:pPr>
+            <w:r>
+              <w:rPr>
+                <w:rFonts w:ascii="Times New Roman" w:hAnsi="Times New Roman" w:cs="Times New Roman"/>
+                <w:sz w:val="24"/>
+                <w:szCs w:val="24"/>
+              </w:rPr>
+              <w:t>V</w:t>
+            </w:r>
           </w:p>
         </w:tc>
       </w:tr>
       <w:tr>
+        <w:trPr>
+          <w:trHeight w:val="288"/>
+        </w:trPr>
         <w:tc>
           <w:tcPr>
             <w:tcW w:w="3128" w:type="dxa"/>
@@ -1550,6 +1767,7 @@
               <w:spacing w:after="420" w:line="240" w:lineRule="auto"/>
               <w:jc w:val="center"/>
               <w:rPr>
+                <w:rFonts w:ascii="Times New Roman" w:hAnsi="Times New Roman" w:cs="Times New Roman"/>
                 <w:sz w:val="24"/>
                 <w:szCs w:val="24"/>
               </w:rPr>
@@ -1565,10 +1783,19 @@
               <w:spacing w:after="420" w:line="240" w:lineRule="auto"/>
               <w:jc w:val="center"/>
               <w:rPr>
+                <w:rFonts w:ascii="Times New Roman" w:hAnsi="Times New Roman" w:cs="Times New Roman"/>
                 <w:sz w:val="24"/>
                 <w:szCs w:val="24"/>
               </w:rPr>
             </w:pPr>
+            <w:r>
+              <w:rPr>
+                <w:rFonts w:ascii="Times New Roman" w:hAnsi="Times New Roman" w:cs="Times New Roman"/>
+                <w:sz w:val="24"/>
+                <w:szCs w:val="24"/>
+              </w:rPr>
+              <w:t>LIST OF FIGURES</w:t>
+            </w:r>
           </w:p>
         </w:tc>
         <w:tc>
@@ -1580,14 +1807,26 @@
               <w:spacing w:after="420" w:line="240" w:lineRule="auto"/>
               <w:jc w:val="center"/>
               <w:rPr>
+                <w:rFonts w:ascii="Times New Roman" w:hAnsi="Times New Roman" w:cs="Times New Roman"/>
                 <w:sz w:val="24"/>
                 <w:szCs w:val="24"/>
               </w:rPr>
             </w:pPr>
+            <w:r>
+              <w:rPr>
+                <w:rFonts w:ascii="Times New Roman" w:hAnsi="Times New Roman" w:cs="Times New Roman"/>
+                <w:sz w:val="24"/>
+                <w:szCs w:val="24"/>
+              </w:rPr>
+              <w:t xml:space="preserve">VI       </w:t>
+            </w:r>
           </w:p>
         </w:tc>
       </w:tr>
       <w:tr>
+        <w:trPr>
+          <w:trHeight w:val="288"/>
+        </w:trPr>
         <w:tc>
           <w:tcPr>
             <w:tcW w:w="3128" w:type="dxa"/>
@@ -1597,6 +1836,7 @@
               <w:spacing w:after="420" w:line="240" w:lineRule="auto"/>
               <w:jc w:val="center"/>
               <w:rPr>
+                <w:rFonts w:ascii="Times New Roman" w:hAnsi="Times New Roman" w:cs="Times New Roman"/>
                 <w:sz w:val="24"/>
                 <w:szCs w:val="24"/>
               </w:rPr>
@@ -1612,10 +1852,19 @@
               <w:spacing w:after="420" w:line="240" w:lineRule="auto"/>
               <w:jc w:val="center"/>
               <w:rPr>
+                <w:rFonts w:ascii="Times New Roman" w:hAnsi="Times New Roman" w:cs="Times New Roman"/>
                 <w:sz w:val="24"/>
                 <w:szCs w:val="24"/>
               </w:rPr>
             </w:pPr>
+            <w:r>
+              <w:rPr>
+                <w:rFonts w:ascii="Times New Roman" w:hAnsi="Times New Roman" w:cs="Times New Roman"/>
+                <w:sz w:val="24"/>
+                <w:szCs w:val="24"/>
+              </w:rPr>
+              <w:t>LIST OF TABLES</w:t>
+            </w:r>
           </w:p>
         </w:tc>
         <w:tc>
@@ -1627,14 +1876,26 @@
               <w:spacing w:after="420" w:line="240" w:lineRule="auto"/>
               <w:jc w:val="center"/>
               <w:rPr>
+                <w:rFonts w:ascii="Times New Roman" w:hAnsi="Times New Roman" w:cs="Times New Roman"/>
                 <w:sz w:val="24"/>
                 <w:szCs w:val="24"/>
               </w:rPr>
             </w:pPr>
+            <w:r>
+              <w:rPr>
+                <w:rFonts w:ascii="Times New Roman" w:hAnsi="Times New Roman" w:cs="Times New Roman"/>
+                <w:sz w:val="24"/>
+                <w:szCs w:val="24"/>
+              </w:rPr>
+              <w:t>VII</w:t>
+            </w:r>
           </w:p>
         </w:tc>
       </w:tr>
       <w:tr>
+        <w:trPr>
+          <w:trHeight w:val="288"/>
+        </w:trPr>
         <w:tc>
           <w:tcPr>
             <w:tcW w:w="3128" w:type="dxa"/>
@@ -1644,6 +1905,7 @@
               <w:spacing w:after="420" w:line="240" w:lineRule="auto"/>
               <w:jc w:val="center"/>
               <w:rPr>
+                <w:rFonts w:ascii="Times New Roman" w:hAnsi="Times New Roman" w:cs="Times New Roman"/>
                 <w:sz w:val="24"/>
                 <w:szCs w:val="24"/>
               </w:rPr>
@@ -1659,10 +1921,19 @@
               <w:spacing w:after="420" w:line="240" w:lineRule="auto"/>
               <w:jc w:val="center"/>
               <w:rPr>
+                <w:rFonts w:ascii="Times New Roman" w:hAnsi="Times New Roman" w:cs="Times New Roman"/>
                 <w:sz w:val="24"/>
                 <w:szCs w:val="24"/>
               </w:rPr>
             </w:pPr>
+            <w:r>
+              <w:rPr>
+                <w:rFonts w:ascii="Times New Roman" w:hAnsi="Times New Roman" w:cs="Times New Roman"/>
+                <w:sz w:val="24"/>
+                <w:szCs w:val="24"/>
+              </w:rPr>
+              <w:t>LIST OF ABBREVIATIONS</w:t>
+            </w:r>
           </w:p>
         </w:tc>
         <w:tc>
@@ -1674,14 +1945,26 @@
               <w:spacing w:after="420" w:line="240" w:lineRule="auto"/>
               <w:jc w:val="center"/>
               <w:rPr>
+                <w:rFonts w:ascii="Times New Roman" w:hAnsi="Times New Roman" w:cs="Times New Roman"/>
                 <w:sz w:val="24"/>
                 <w:szCs w:val="24"/>
               </w:rPr>
             </w:pPr>
+            <w:r>
+              <w:rPr>
+                <w:rFonts w:ascii="Times New Roman" w:hAnsi="Times New Roman" w:cs="Times New Roman"/>
+                <w:sz w:val="24"/>
+                <w:szCs w:val="24"/>
+              </w:rPr>
+              <w:t>VIII</w:t>
+            </w:r>
           </w:p>
         </w:tc>
       </w:tr>
       <w:tr>
+        <w:trPr>
+          <w:trHeight w:val="288"/>
+        </w:trPr>
         <w:tc>
           <w:tcPr>
             <w:tcW w:w="3128" w:type="dxa"/>
@@ -1691,6 +1974,7 @@
               <w:spacing w:after="420" w:line="240" w:lineRule="auto"/>
               <w:jc w:val="center"/>
               <w:rPr>
+                <w:rFonts w:ascii="Times New Roman" w:hAnsi="Times New Roman" w:cs="Times New Roman"/>
                 <w:sz w:val="24"/>
                 <w:szCs w:val="24"/>
               </w:rPr>
@@ -1706,10 +1990,19 @@
               <w:spacing w:after="420" w:line="240" w:lineRule="auto"/>
               <w:jc w:val="center"/>
               <w:rPr>
+                <w:rFonts w:ascii="Times New Roman" w:hAnsi="Times New Roman" w:cs="Times New Roman"/>
                 <w:sz w:val="24"/>
                 <w:szCs w:val="24"/>
               </w:rPr>
             </w:pPr>
+            <w:r>
+              <w:rPr>
+                <w:rFonts w:ascii="Times New Roman" w:hAnsi="Times New Roman" w:cs="Times New Roman"/>
+                <w:sz w:val="24"/>
+                <w:szCs w:val="24"/>
+              </w:rPr>
+              <w:t>ABSTRACT</w:t>
+            </w:r>
           </w:p>
         </w:tc>
         <w:tc>
@@ -1721,14 +2014,26 @@
               <w:spacing w:after="420" w:line="240" w:lineRule="auto"/>
               <w:jc w:val="center"/>
               <w:rPr>
+                <w:rFonts w:ascii="Times New Roman" w:hAnsi="Times New Roman" w:cs="Times New Roman"/>
                 <w:sz w:val="24"/>
                 <w:szCs w:val="24"/>
               </w:rPr>
             </w:pPr>
+            <w:r>
+              <w:rPr>
+                <w:rFonts w:ascii="Times New Roman" w:hAnsi="Times New Roman" w:cs="Times New Roman"/>
+                <w:sz w:val="24"/>
+                <w:szCs w:val="24"/>
+              </w:rPr>
+              <w:t>IX-X</w:t>
+            </w:r>
           </w:p>
         </w:tc>
       </w:tr>
       <w:tr>
+        <w:trPr>
+          <w:trHeight w:val="288"/>
+        </w:trPr>
         <w:tc>
           <w:tcPr>
             <w:tcW w:w="3128" w:type="dxa"/>
@@ -1738,6 +2043,7 @@
               <w:spacing w:after="420" w:line="240" w:lineRule="auto"/>
               <w:jc w:val="center"/>
               <w:rPr>
+                <w:rFonts w:ascii="Times New Roman" w:hAnsi="Times New Roman" w:cs="Times New Roman"/>
                 <w:sz w:val="24"/>
                 <w:szCs w:val="24"/>
               </w:rPr>
@@ -1753,10 +2059,19 @@
               <w:spacing w:after="420" w:line="240" w:lineRule="auto"/>
               <w:jc w:val="center"/>
               <w:rPr>
+                <w:rFonts w:ascii="Times New Roman" w:hAnsi="Times New Roman" w:cs="Times New Roman"/>
                 <w:sz w:val="24"/>
                 <w:szCs w:val="24"/>
               </w:rPr>
             </w:pPr>
+            <w:r>
+              <w:rPr>
+                <w:rFonts w:ascii="Times New Roman" w:hAnsi="Times New Roman" w:cs="Times New Roman"/>
+                <w:sz w:val="24"/>
+                <w:szCs w:val="24"/>
+              </w:rPr>
+              <w:t>INTRODUCTION</w:t>
+            </w:r>
           </w:p>
         </w:tc>
         <w:tc>
@@ -1768,14 +2083,26 @@
               <w:spacing w:after="420" w:line="240" w:lineRule="auto"/>
               <w:jc w:val="center"/>
               <w:rPr>
+                <w:rFonts w:ascii="Times New Roman" w:hAnsi="Times New Roman" w:cs="Times New Roman"/>
                 <w:sz w:val="24"/>
                 <w:szCs w:val="24"/>
               </w:rPr>
             </w:pPr>
+            <w:r>
+              <w:rPr>
+                <w:rFonts w:ascii="Times New Roman" w:hAnsi="Times New Roman" w:cs="Times New Roman"/>
+                <w:sz w:val="24"/>
+                <w:szCs w:val="24"/>
+              </w:rPr>
+              <w:t>1</w:t>
+            </w:r>
           </w:p>
         </w:tc>
       </w:tr>
       <w:tr>
+        <w:trPr>
+          <w:trHeight w:val="288"/>
+        </w:trPr>
         <w:tc>
           <w:tcPr>
             <w:tcW w:w="3128" w:type="dxa"/>
@@ -1785,6 +2112,7 @@
               <w:spacing w:after="420" w:line="240" w:lineRule="auto"/>
               <w:jc w:val="center"/>
               <w:rPr>
+                <w:rFonts w:ascii="Times New Roman" w:hAnsi="Times New Roman" w:cs="Times New Roman"/>
                 <w:sz w:val="24"/>
                 <w:szCs w:val="24"/>
               </w:rPr>
@@ -1800,10 +2128,19 @@
               <w:spacing w:after="420" w:line="240" w:lineRule="auto"/>
               <w:jc w:val="center"/>
               <w:rPr>
+                <w:rFonts w:ascii="Times New Roman" w:hAnsi="Times New Roman" w:cs="Times New Roman"/>
                 <w:sz w:val="24"/>
                 <w:szCs w:val="24"/>
               </w:rPr>
             </w:pPr>
+            <w:r>
+              <w:rPr>
+                <w:rFonts w:ascii="Times New Roman" w:hAnsi="Times New Roman" w:cs="Times New Roman"/>
+                <w:sz w:val="24"/>
+                <w:szCs w:val="24"/>
+              </w:rPr>
+              <w:t>OBJECTIVES, SCOPE, AND PURPOSE OF STUDY</w:t>
+            </w:r>
           </w:p>
         </w:tc>
         <w:tc>
@@ -1815,14 +2152,26 @@
               <w:spacing w:after="420" w:line="240" w:lineRule="auto"/>
               <w:jc w:val="center"/>
               <w:rPr>
+                <w:rFonts w:ascii="Times New Roman" w:hAnsi="Times New Roman" w:cs="Times New Roman"/>
                 <w:sz w:val="24"/>
                 <w:szCs w:val="24"/>
               </w:rPr>
             </w:pPr>
+            <w:r>
+              <w:rPr>
+                <w:rFonts w:ascii="Times New Roman" w:hAnsi="Times New Roman" w:cs="Times New Roman"/>
+                <w:sz w:val="24"/>
+                <w:szCs w:val="24"/>
+              </w:rPr>
+              <w:t>2</w:t>
+            </w:r>
           </w:p>
         </w:tc>
       </w:tr>
       <w:tr>
+        <w:trPr>
+          <w:trHeight w:val="288"/>
+        </w:trPr>
         <w:tc>
           <w:tcPr>
             <w:tcW w:w="3128" w:type="dxa"/>
@@ -1832,6 +2181,7 @@
               <w:spacing w:after="420" w:line="240" w:lineRule="auto"/>
               <w:jc w:val="center"/>
               <w:rPr>
+                <w:rFonts w:ascii="Times New Roman" w:hAnsi="Times New Roman" w:cs="Times New Roman"/>
                 <w:sz w:val="24"/>
                 <w:szCs w:val="24"/>
               </w:rPr>
@@ -1847,10 +2197,19 @@
               <w:spacing w:after="420" w:line="240" w:lineRule="auto"/>
               <w:jc w:val="center"/>
               <w:rPr>
+                <w:rFonts w:ascii="Times New Roman" w:hAnsi="Times New Roman" w:cs="Times New Roman"/>
                 <w:sz w:val="24"/>
                 <w:szCs w:val="24"/>
               </w:rPr>
             </w:pPr>
+            <w:r>
+              <w:rPr>
+                <w:rFonts w:ascii="Times New Roman" w:hAnsi="Times New Roman" w:cs="Times New Roman"/>
+                <w:sz w:val="24"/>
+                <w:szCs w:val="24"/>
+              </w:rPr>
+              <w:t>REVIEW OF LITERATURE</w:t>
+            </w:r>
           </w:p>
         </w:tc>
         <w:tc>
@@ -1862,14 +2221,26 @@
               <w:spacing w:after="420" w:line="240" w:lineRule="auto"/>
               <w:jc w:val="center"/>
               <w:rPr>
+                <w:rFonts w:ascii="Times New Roman" w:hAnsi="Times New Roman" w:cs="Times New Roman"/>
                 <w:sz w:val="24"/>
                 <w:szCs w:val="24"/>
               </w:rPr>
             </w:pPr>
+            <w:r>
+              <w:rPr>
+                <w:rFonts w:ascii="Times New Roman" w:hAnsi="Times New Roman" w:cs="Times New Roman"/>
+                <w:sz w:val="24"/>
+                <w:szCs w:val="24"/>
+              </w:rPr>
+              <w:t>3</w:t>
+            </w:r>
           </w:p>
         </w:tc>
       </w:tr>
       <w:tr>
+        <w:trPr>
+          <w:trHeight w:val="288"/>
+        </w:trPr>
         <w:tc>
           <w:tcPr>
             <w:tcW w:w="3128" w:type="dxa"/>
@@ -1879,6 +2250,7 @@
               <w:spacing w:after="420" w:line="240" w:lineRule="auto"/>
               <w:jc w:val="center"/>
               <w:rPr>
+                <w:rFonts w:ascii="Times New Roman" w:hAnsi="Times New Roman" w:cs="Times New Roman"/>
                 <w:sz w:val="24"/>
                 <w:szCs w:val="24"/>
               </w:rPr>
@@ -1894,10 +2266,19 @@
               <w:spacing w:after="420" w:line="240" w:lineRule="auto"/>
               <w:jc w:val="center"/>
               <w:rPr>
+                <w:rFonts w:ascii="Times New Roman" w:hAnsi="Times New Roman" w:cs="Times New Roman"/>
                 <w:sz w:val="24"/>
                 <w:szCs w:val="24"/>
               </w:rPr>
             </w:pPr>
+            <w:r>
+              <w:rPr>
+                <w:rFonts w:ascii="Times New Roman" w:hAnsi="Times New Roman" w:cs="Times New Roman"/>
+                <w:sz w:val="24"/>
+                <w:szCs w:val="24"/>
+              </w:rPr>
+              <w:t>RESEARCH METHODOLOGY</w:t>
+            </w:r>
           </w:p>
         </w:tc>
         <w:tc>
@@ -1909,14 +2290,26 @@
               <w:spacing w:after="420" w:line="240" w:lineRule="auto"/>
               <w:jc w:val="center"/>
               <w:rPr>
+                <w:rFonts w:ascii="Times New Roman" w:hAnsi="Times New Roman" w:cs="Times New Roman"/>
                 <w:sz w:val="24"/>
                 <w:szCs w:val="24"/>
               </w:rPr>
             </w:pPr>
+            <w:r>
+              <w:rPr>
+                <w:rFonts w:ascii="Times New Roman" w:hAnsi="Times New Roman" w:cs="Times New Roman"/>
+                <w:sz w:val="24"/>
+                <w:szCs w:val="24"/>
+              </w:rPr>
+              <w:t>4</w:t>
+            </w:r>
           </w:p>
         </w:tc>
       </w:tr>
       <w:tr>
+        <w:trPr>
+          <w:trHeight w:val="288"/>
+        </w:trPr>
         <w:tc>
           <w:tcPr>
             <w:tcW w:w="3128" w:type="dxa"/>
@@ -1926,6 +2319,7 @@
               <w:spacing w:after="420" w:line="240" w:lineRule="auto"/>
               <w:jc w:val="center"/>
               <w:rPr>
+                <w:rFonts w:ascii="Times New Roman" w:hAnsi="Times New Roman" w:cs="Times New Roman"/>
                 <w:sz w:val="24"/>
                 <w:szCs w:val="24"/>
               </w:rPr>
@@ -1941,10 +2335,19 @@
               <w:spacing w:after="420" w:line="240" w:lineRule="auto"/>
               <w:jc w:val="center"/>
               <w:rPr>
+                <w:rFonts w:ascii="Times New Roman" w:hAnsi="Times New Roman" w:cs="Times New Roman"/>
                 <w:sz w:val="24"/>
                 <w:szCs w:val="24"/>
               </w:rPr>
             </w:pPr>
+            <w:r>
+              <w:rPr>
+                <w:rFonts w:ascii="Times New Roman" w:hAnsi="Times New Roman" w:cs="Times New Roman"/>
+                <w:sz w:val="24"/>
+                <w:szCs w:val="24"/>
+              </w:rPr>
+              <w:t>DATA COLLECTION AND ANALYSIS</w:t>
+            </w:r>
           </w:p>
         </w:tc>
         <w:tc>
@@ -1956,14 +2359,26 @@
               <w:spacing w:after="420" w:line="240" w:lineRule="auto"/>
               <w:jc w:val="center"/>
               <w:rPr>
+                <w:rFonts w:ascii="Times New Roman" w:hAnsi="Times New Roman" w:cs="Times New Roman"/>
                 <w:sz w:val="24"/>
                 <w:szCs w:val="24"/>
               </w:rPr>
             </w:pPr>
+            <w:r>
+              <w:rPr>
+                <w:rFonts w:ascii="Times New Roman" w:hAnsi="Times New Roman" w:cs="Times New Roman"/>
+                <w:sz w:val="24"/>
+                <w:szCs w:val="24"/>
+              </w:rPr>
+              <w:t>5</w:t>
+            </w:r>
           </w:p>
         </w:tc>
       </w:tr>
       <w:tr>
+        <w:trPr>
+          <w:trHeight w:val="288"/>
+        </w:trPr>
         <w:tc>
           <w:tcPr>
             <w:tcW w:w="3128" w:type="dxa"/>
@@ -1973,6 +2388,7 @@
               <w:spacing w:after="420" w:line="240" w:lineRule="auto"/>
               <w:jc w:val="center"/>
               <w:rPr>
+                <w:rFonts w:ascii="Times New Roman" w:hAnsi="Times New Roman" w:cs="Times New Roman"/>
                 <w:sz w:val="24"/>
                 <w:szCs w:val="24"/>
               </w:rPr>
@@ -1988,10 +2404,19 @@
               <w:spacing w:after="420" w:line="240" w:lineRule="auto"/>
               <w:jc w:val="center"/>
               <w:rPr>
+                <w:rFonts w:ascii="Times New Roman" w:hAnsi="Times New Roman" w:cs="Times New Roman"/>
                 <w:sz w:val="24"/>
                 <w:szCs w:val="24"/>
               </w:rPr>
             </w:pPr>
+            <w:r>
+              <w:rPr>
+                <w:rFonts w:ascii="Times New Roman" w:hAnsi="Times New Roman" w:cs="Times New Roman"/>
+                <w:sz w:val="24"/>
+                <w:szCs w:val="24"/>
+              </w:rPr>
+              <w:t>FINDINGS AND INTERPRETATION</w:t>
+            </w:r>
           </w:p>
         </w:tc>
         <w:tc>
@@ -2003,14 +2428,26 @@
               <w:spacing w:after="420" w:line="240" w:lineRule="auto"/>
               <w:jc w:val="center"/>
               <w:rPr>
+                <w:rFonts w:ascii="Times New Roman" w:hAnsi="Times New Roman" w:cs="Times New Roman"/>
                 <w:sz w:val="24"/>
                 <w:szCs w:val="24"/>
               </w:rPr>
             </w:pPr>
+            <w:r>
+              <w:rPr>
+                <w:rFonts w:ascii="Times New Roman" w:hAnsi="Times New Roman" w:cs="Times New Roman"/>
+                <w:sz w:val="24"/>
+                <w:szCs w:val="24"/>
+              </w:rPr>
+              <w:t>6</w:t>
+            </w:r>
           </w:p>
         </w:tc>
       </w:tr>
       <w:tr>
+        <w:trPr>
+          <w:trHeight w:val="288"/>
+        </w:trPr>
         <w:tc>
           <w:tcPr>
             <w:tcW w:w="3128" w:type="dxa"/>
@@ -2020,6 +2457,7 @@
               <w:spacing w:after="420" w:line="240" w:lineRule="auto"/>
               <w:jc w:val="center"/>
               <w:rPr>
+                <w:rFonts w:ascii="Times New Roman" w:hAnsi="Times New Roman" w:cs="Times New Roman"/>
                 <w:sz w:val="24"/>
                 <w:szCs w:val="24"/>
               </w:rPr>
@@ -2035,10 +2473,19 @@
               <w:spacing w:after="420" w:line="240" w:lineRule="auto"/>
               <w:jc w:val="center"/>
               <w:rPr>
+                <w:rFonts w:ascii="Times New Roman" w:hAnsi="Times New Roman" w:cs="Times New Roman"/>
                 <w:sz w:val="24"/>
                 <w:szCs w:val="24"/>
               </w:rPr>
             </w:pPr>
+            <w:r>
+              <w:rPr>
+                <w:rFonts w:ascii="Times New Roman" w:hAnsi="Times New Roman" w:cs="Times New Roman"/>
+                <w:sz w:val="24"/>
+                <w:szCs w:val="24"/>
+              </w:rPr>
+              <w:t>RECOMMENDATIONS AND CONCLUSION</w:t>
+            </w:r>
           </w:p>
         </w:tc>
         <w:tc>
@@ -2050,14 +2497,26 @@
               <w:spacing w:after="420" w:line="240" w:lineRule="auto"/>
               <w:jc w:val="center"/>
               <w:rPr>
+                <w:rFonts w:ascii="Times New Roman" w:hAnsi="Times New Roman" w:cs="Times New Roman"/>
                 <w:sz w:val="24"/>
                 <w:szCs w:val="24"/>
               </w:rPr>
             </w:pPr>
+            <w:r>
+              <w:rPr>
+                <w:rFonts w:ascii="Times New Roman" w:hAnsi="Times New Roman" w:cs="Times New Roman"/>
+                <w:sz w:val="24"/>
+                <w:szCs w:val="24"/>
+              </w:rPr>
+              <w:t>7</w:t>
+            </w:r>
           </w:p>
         </w:tc>
       </w:tr>
       <w:tr>
+        <w:trPr>
+          <w:trHeight w:val="288"/>
+        </w:trPr>
         <w:tc>
           <w:tcPr>
             <w:tcW w:w="3128" w:type="dxa"/>
@@ -2067,6 +2526,7 @@
               <w:spacing w:after="420" w:line="240" w:lineRule="auto"/>
               <w:jc w:val="center"/>
               <w:rPr>
+                <w:rFonts w:ascii="Times New Roman" w:hAnsi="Times New Roman" w:cs="Times New Roman"/>
                 <w:sz w:val="24"/>
                 <w:szCs w:val="24"/>
               </w:rPr>
@@ -2082,10 +2542,19 @@
               <w:spacing w:after="420" w:line="240" w:lineRule="auto"/>
               <w:jc w:val="center"/>
               <w:rPr>
+                <w:rFonts w:ascii="Times New Roman" w:hAnsi="Times New Roman" w:cs="Times New Roman"/>
                 <w:sz w:val="24"/>
                 <w:szCs w:val="24"/>
               </w:rPr>
             </w:pPr>
+            <w:r>
+              <w:rPr>
+                <w:rFonts w:ascii="Times New Roman" w:hAnsi="Times New Roman" w:cs="Times New Roman"/>
+                <w:sz w:val="24"/>
+                <w:szCs w:val="24"/>
+              </w:rPr>
+              <w:t>BIBLIOGRAPHY</w:t>
+            </w:r>
           </w:p>
         </w:tc>
         <w:tc>
@@ -2097,6 +2566,7 @@
               <w:spacing w:after="420" w:line="240" w:lineRule="auto"/>
               <w:jc w:val="center"/>
               <w:rPr>
+                <w:rFonts w:ascii="Times New Roman" w:hAnsi="Times New Roman" w:cs="Times New Roman"/>
                 <w:sz w:val="24"/>
                 <w:szCs w:val="24"/>
               </w:rPr>
@@ -2105,6 +2575,9 @@
         </w:tc>
       </w:tr>
       <w:tr>
+        <w:trPr>
+          <w:trHeight w:val="288"/>
+        </w:trPr>
         <w:tc>
           <w:tcPr>
             <w:tcW w:w="3128" w:type="dxa"/>
@@ -2114,6 +2587,7 @@
               <w:spacing w:after="420" w:line="240" w:lineRule="auto"/>
               <w:jc w:val="center"/>
               <w:rPr>
+                <w:rFonts w:ascii="Times New Roman" w:hAnsi="Times New Roman" w:cs="Times New Roman"/>
                 <w:sz w:val="24"/>
                 <w:szCs w:val="24"/>
               </w:rPr>
@@ -2129,10 +2603,19 @@
               <w:spacing w:after="420" w:line="240" w:lineRule="auto"/>
               <w:jc w:val="center"/>
               <w:rPr>
+                <w:rFonts w:ascii="Times New Roman" w:hAnsi="Times New Roman" w:cs="Times New Roman"/>
                 <w:sz w:val="24"/>
                 <w:szCs w:val="24"/>
               </w:rPr>
             </w:pPr>
+            <w:r>
+              <w:rPr>
+                <w:rFonts w:ascii="Times New Roman" w:hAnsi="Times New Roman" w:cs="Times New Roman"/>
+                <w:sz w:val="24"/>
+                <w:szCs w:val="24"/>
+              </w:rPr>
+              <w:t>ANNEXURES</w:t>
+            </w:r>
           </w:p>
         </w:tc>
         <w:tc>
@@ -2144,53 +2627,7 @@
               <w:spacing w:after="420" w:line="240" w:lineRule="auto"/>
               <w:jc w:val="center"/>
               <w:rPr>
-                <w:sz w:val="24"/>
-                <w:szCs w:val="24"/>
-              </w:rPr>
-            </w:pPr>
-          </w:p>
-        </w:tc>
-      </w:tr>
-      <w:tr>
-        <w:tc>
-          <w:tcPr>
-            <w:tcW w:w="3128" w:type="dxa"/>
-          </w:tcPr>
-          <w:p>
-            <w:pPr>
-              <w:spacing w:after="420" w:line="240" w:lineRule="auto"/>
-              <w:jc w:val="center"/>
-              <w:rPr>
-                <w:sz w:val="24"/>
-                <w:szCs w:val="24"/>
-              </w:rPr>
-            </w:pPr>
-          </w:p>
-        </w:tc>
-        <w:tc>
-          <w:tcPr>
-            <w:tcW w:w="3128" w:type="dxa"/>
-          </w:tcPr>
-          <w:p>
-            <w:pPr>
-              <w:spacing w:after="420" w:line="240" w:lineRule="auto"/>
-              <w:jc w:val="center"/>
-              <w:rPr>
-                <w:sz w:val="24"/>
-                <w:szCs w:val="24"/>
-              </w:rPr>
-            </w:pPr>
-          </w:p>
-        </w:tc>
-        <w:tc>
-          <w:tcPr>
-            <w:tcW w:w="3129" w:type="dxa"/>
-          </w:tcPr>
-          <w:p>
-            <w:pPr>
-              <w:spacing w:after="420" w:line="240" w:lineRule="auto"/>
-              <w:jc w:val="center"/>
-              <w:rPr>
+                <w:rFonts w:ascii="Times New Roman" w:hAnsi="Times New Roman" w:cs="Times New Roman"/>
                 <w:sz w:val="24"/>
                 <w:szCs w:val="24"/>
               </w:rPr>
@@ -2205,21 +2642,2690 @@
         <w:ind w:left="515" w:hanging="10"/>
         <w:jc w:val="center"/>
         <w:rPr>
-          <w:sz w:val="24"/>
-          <w:szCs w:val="24"/>
-        </w:rPr>
-      </w:pPr>
-    </w:p>
-    <w:p>
-      <w:pPr>
-        <w:spacing w:after="420" w:line="240" w:lineRule="auto"/>
-        <w:ind w:left="515" w:hanging="10"/>
-        <w:jc w:val="center"/>
-        <w:rPr>
-          <w:sz w:val="24"/>
-          <w:szCs w:val="24"/>
-        </w:rPr>
-      </w:pPr>
+          <w:rFonts w:ascii="Times New Roman" w:hAnsi="Times New Roman" w:cs="Times New Roman"/>
+          <w:sz w:val="24"/>
+          <w:szCs w:val="24"/>
+        </w:rPr>
+      </w:pPr>
+    </w:p>
+    <w:p>
+      <w:pPr>
+        <w:spacing w:after="420" w:line="240" w:lineRule="auto"/>
+        <w:ind w:left="515" w:hanging="10"/>
+        <w:jc w:val="center"/>
+        <w:rPr>
+          <w:rFonts w:ascii="Times New Roman" w:hAnsi="Times New Roman" w:cs="Times New Roman"/>
+          <w:sz w:val="24"/>
+          <w:szCs w:val="24"/>
+        </w:rPr>
+      </w:pPr>
+    </w:p>
+    <w:p>
+      <w:pPr>
+        <w:spacing w:after="420" w:line="240" w:lineRule="auto"/>
+        <w:ind w:left="515" w:hanging="10"/>
+        <w:jc w:val="center"/>
+        <w:rPr>
+          <w:rFonts w:ascii="Times New Roman" w:hAnsi="Times New Roman" w:cs="Times New Roman"/>
+          <w:sz w:val="24"/>
+          <w:szCs w:val="24"/>
+        </w:rPr>
+      </w:pPr>
+    </w:p>
+    <w:p>
+      <w:pPr>
+        <w:spacing w:after="420" w:line="240" w:lineRule="auto"/>
+        <w:ind w:left="515" w:hanging="10"/>
+        <w:jc w:val="center"/>
+        <w:rPr>
+          <w:rFonts w:ascii="Times New Roman" w:hAnsi="Times New Roman" w:cs="Times New Roman"/>
+          <w:sz w:val="24"/>
+          <w:szCs w:val="24"/>
+        </w:rPr>
+      </w:pPr>
+    </w:p>
+    <w:p>
+      <w:pPr>
+        <w:spacing w:after="420" w:line="240" w:lineRule="auto"/>
+        <w:ind w:left="515" w:hanging="10"/>
+        <w:jc w:val="center"/>
+        <w:rPr>
+          <w:rFonts w:ascii="Times New Roman" w:hAnsi="Times New Roman" w:cs="Times New Roman"/>
+          <w:sz w:val="24"/>
+          <w:szCs w:val="24"/>
+        </w:rPr>
+      </w:pPr>
+    </w:p>
+    <w:p>
+      <w:pPr>
+        <w:spacing w:after="420" w:line="240" w:lineRule="auto"/>
+        <w:ind w:left="515" w:hanging="10"/>
+        <w:jc w:val="center"/>
+        <w:rPr>
+          <w:rFonts w:ascii="Times New Roman" w:hAnsi="Times New Roman" w:cs="Times New Roman"/>
+          <w:sz w:val="24"/>
+          <w:szCs w:val="24"/>
+        </w:rPr>
+      </w:pPr>
+    </w:p>
+    <w:p>
+      <w:pPr>
+        <w:spacing w:after="420" w:line="240" w:lineRule="auto"/>
+        <w:ind w:left="515" w:hanging="10"/>
+        <w:jc w:val="center"/>
+        <w:rPr>
+          <w:rFonts w:ascii="Times New Roman" w:hAnsi="Times New Roman" w:cs="Times New Roman"/>
+          <w:sz w:val="24"/>
+          <w:szCs w:val="24"/>
+        </w:rPr>
+      </w:pPr>
+    </w:p>
+    <w:p>
+      <w:pPr>
+        <w:spacing w:after="420" w:line="240" w:lineRule="auto"/>
+        <w:ind w:left="515" w:hanging="10"/>
+        <w:jc w:val="center"/>
+        <w:rPr>
+          <w:rFonts w:ascii="Times New Roman" w:hAnsi="Times New Roman" w:cs="Times New Roman"/>
+          <w:sz w:val="24"/>
+          <w:szCs w:val="24"/>
+        </w:rPr>
+      </w:pPr>
+    </w:p>
+    <w:p>
+      <w:pPr>
+        <w:spacing w:after="420" w:line="240" w:lineRule="auto"/>
+        <w:ind w:left="515" w:hanging="10"/>
+        <w:jc w:val="center"/>
+        <w:rPr>
+          <w:rFonts w:ascii="Times New Roman" w:hAnsi="Times New Roman" w:cs="Times New Roman"/>
+          <w:sz w:val="24"/>
+          <w:szCs w:val="24"/>
+        </w:rPr>
+      </w:pPr>
+    </w:p>
+    <w:p>
+      <w:pPr>
+        <w:spacing w:after="420" w:line="240" w:lineRule="auto"/>
+        <w:ind w:left="515" w:hanging="10"/>
+        <w:jc w:val="center"/>
+        <w:rPr>
+          <w:rFonts w:ascii="Times New Roman" w:hAnsi="Times New Roman" w:cs="Times New Roman"/>
+          <w:sz w:val="24"/>
+          <w:szCs w:val="24"/>
+        </w:rPr>
+      </w:pPr>
+    </w:p>
+    <w:p>
+      <w:pPr>
+        <w:spacing w:after="420" w:line="240" w:lineRule="auto"/>
+        <w:ind w:left="515" w:hanging="10"/>
+        <w:jc w:val="center"/>
+        <w:rPr>
+          <w:rFonts w:ascii="Times New Roman" w:hAnsi="Times New Roman" w:cs="Times New Roman"/>
+          <w:sz w:val="24"/>
+          <w:szCs w:val="24"/>
+        </w:rPr>
+      </w:pPr>
+    </w:p>
+    <w:p>
+      <w:pPr>
+        <w:spacing w:after="420" w:line="240" w:lineRule="auto"/>
+        <w:ind w:left="515" w:hanging="10"/>
+        <w:jc w:val="center"/>
+        <w:rPr>
+          <w:rFonts w:ascii="Times New Roman" w:hAnsi="Times New Roman" w:cs="Times New Roman"/>
+          <w:sz w:val="24"/>
+          <w:szCs w:val="24"/>
+        </w:rPr>
+      </w:pPr>
+    </w:p>
+    <w:p>
+      <w:pPr>
+        <w:spacing w:after="420" w:line="240" w:lineRule="auto"/>
+        <w:ind w:left="515" w:hanging="10"/>
+        <w:jc w:val="center"/>
+        <w:rPr>
+          <w:rFonts w:ascii="Times New Roman" w:hAnsi="Times New Roman" w:cs="Times New Roman"/>
+          <w:sz w:val="24"/>
+          <w:szCs w:val="24"/>
+        </w:rPr>
+      </w:pPr>
+    </w:p>
+    <w:p>
+      <w:pPr>
+        <w:spacing w:after="420" w:line="240" w:lineRule="auto"/>
+        <w:ind w:left="515" w:hanging="10"/>
+        <w:jc w:val="center"/>
+        <w:rPr>
+          <w:rFonts w:ascii="Times New Roman" w:hAnsi="Times New Roman" w:cs="Times New Roman"/>
+          <w:sz w:val="24"/>
+          <w:szCs w:val="24"/>
+        </w:rPr>
+      </w:pPr>
+    </w:p>
+    <w:p>
+      <w:pPr>
+        <w:spacing w:after="420" w:line="240" w:lineRule="auto"/>
+        <w:ind w:left="515" w:hanging="10"/>
+        <w:jc w:val="center"/>
+        <w:rPr>
+          <w:rFonts w:ascii="Times New Roman" w:hAnsi="Times New Roman" w:cs="Times New Roman"/>
+          <w:sz w:val="24"/>
+          <w:szCs w:val="24"/>
+        </w:rPr>
+      </w:pPr>
+    </w:p>
+    <w:p>
+      <w:pPr>
+        <w:spacing w:after="420" w:line="240" w:lineRule="auto"/>
+        <w:ind w:left="515" w:hanging="10"/>
+        <w:jc w:val="center"/>
+        <w:rPr>
+          <w:rFonts w:ascii="Times New Roman" w:hAnsi="Times New Roman" w:cs="Times New Roman"/>
+          <w:sz w:val="24"/>
+          <w:szCs w:val="24"/>
+        </w:rPr>
+      </w:pPr>
+    </w:p>
+    <w:p>
+      <w:pPr>
+        <w:spacing w:after="420" w:line="240" w:lineRule="auto"/>
+        <w:ind w:left="515" w:hanging="10"/>
+        <w:jc w:val="center"/>
+        <w:rPr>
+          <w:rFonts w:ascii="Times New Roman" w:hAnsi="Times New Roman" w:cs="Times New Roman"/>
+          <w:sz w:val="24"/>
+          <w:szCs w:val="24"/>
+        </w:rPr>
+      </w:pPr>
+    </w:p>
+    <w:p>
+      <w:pPr>
+        <w:spacing w:after="420" w:line="240" w:lineRule="auto"/>
+        <w:ind w:left="515" w:hanging="10"/>
+        <w:jc w:val="center"/>
+        <w:rPr>
+          <w:rFonts w:ascii="Times New Roman" w:hAnsi="Times New Roman" w:cs="Times New Roman"/>
+          <w:sz w:val="24"/>
+          <w:szCs w:val="24"/>
+        </w:rPr>
+      </w:pPr>
+    </w:p>
+    <w:p>
+      <w:pPr>
+        <w:spacing w:after="420" w:line="240" w:lineRule="auto"/>
+        <w:ind w:left="515" w:hanging="10"/>
+        <w:jc w:val="center"/>
+        <w:rPr>
+          <w:rFonts w:ascii="Times New Roman" w:hAnsi="Times New Roman" w:cs="Times New Roman"/>
+          <w:sz w:val="24"/>
+          <w:szCs w:val="24"/>
+        </w:rPr>
+      </w:pPr>
+    </w:p>
+    <w:p>
+      <w:pPr>
+        <w:spacing w:after="420" w:line="240" w:lineRule="auto"/>
+        <w:ind w:left="515" w:hanging="10"/>
+        <w:jc w:val="center"/>
+        <w:rPr>
+          <w:rFonts w:ascii="Times New Roman" w:hAnsi="Times New Roman" w:cs="Times New Roman"/>
+          <w:b/>
+          <w:bCs/>
+          <w:sz w:val="28"/>
+          <w:szCs w:val="28"/>
+        </w:rPr>
+      </w:pPr>
+      <w:r>
+        <w:rPr>
+          <w:rFonts w:ascii="Times New Roman" w:hAnsi="Times New Roman" w:cs="Times New Roman"/>
+          <w:b/>
+          <w:bCs/>
+          <w:sz w:val="28"/>
+          <w:szCs w:val="28"/>
+        </w:rPr>
+        <w:t>CHAPTER I</w:t>
+      </w:r>
+    </w:p>
+    <w:p>
+      <w:pPr>
+        <w:spacing w:after="420" w:line="240" w:lineRule="auto"/>
+        <w:ind w:left="515" w:hanging="10"/>
+        <w:jc w:val="center"/>
+        <w:rPr>
+          <w:rFonts w:ascii="Times New Roman" w:hAnsi="Times New Roman" w:cs="Times New Roman"/>
+          <w:b/>
+          <w:bCs/>
+          <w:sz w:val="28"/>
+          <w:szCs w:val="28"/>
+        </w:rPr>
+      </w:pPr>
+      <w:r>
+        <w:rPr>
+          <w:rFonts w:ascii="Times New Roman" w:hAnsi="Times New Roman" w:cs="Times New Roman"/>
+          <w:b/>
+          <w:bCs/>
+          <w:sz w:val="28"/>
+          <w:szCs w:val="28"/>
+        </w:rPr>
+        <w:t>INTRODUCTION</w:t>
+      </w:r>
+    </w:p>
+    <w:p>
+      <w:pPr>
+        <w:spacing w:after="420" w:line="240" w:lineRule="auto"/>
+        <w:ind w:left="515" w:hanging="10"/>
+        <w:jc w:val="center"/>
+        <w:rPr>
+          <w:rFonts w:ascii="Times New Roman" w:hAnsi="Times New Roman" w:cs="Times New Roman"/>
+          <w:b/>
+          <w:bCs/>
+          <w:sz w:val="24"/>
+          <w:szCs w:val="24"/>
+        </w:rPr>
+      </w:pPr>
+      <w:r>
+        <w:rPr>
+          <w:rFonts w:ascii="Times New Roman" w:hAnsi="Times New Roman" w:cs="Times New Roman"/>
+          <w:b/>
+          <w:bCs/>
+          <w:sz w:val="24"/>
+          <w:szCs w:val="24"/>
+        </w:rPr>
+        <w:t>1.1 Introduction to the Telecom Industry</w:t>
+      </w:r>
+    </w:p>
+    <w:p>
+      <w:pPr>
+        <w:spacing w:after="420" w:line="240" w:lineRule="auto"/>
+        <w:ind w:left="515" w:hanging="10"/>
+        <w:rPr>
+          <w:rFonts w:ascii="Times New Roman" w:hAnsi="Times New Roman" w:cs="Times New Roman"/>
+          <w:sz w:val="24"/>
+          <w:szCs w:val="24"/>
+        </w:rPr>
+      </w:pPr>
+      <w:r>
+        <w:rPr>
+          <w:rFonts w:ascii="Times New Roman" w:hAnsi="Times New Roman" w:cs="Times New Roman"/>
+          <w:sz w:val="24"/>
+          <w:szCs w:val="24"/>
+        </w:rPr>
+        <w:t>The telecom industry is really important for our economy. It lets us make voice calls use the internet and watch entertainment. With many people using smartphones and the internet telecom companies have to compete with each other to get and keep customers.</w:t>
+      </w:r>
+    </w:p>
+    <w:p>
+      <w:pPr>
+        <w:spacing w:after="420" w:line="240" w:lineRule="auto"/>
+        <w:ind w:left="515" w:hanging="10"/>
+        <w:rPr>
+          <w:rFonts w:ascii="Times New Roman" w:hAnsi="Times New Roman" w:cs="Times New Roman"/>
+          <w:sz w:val="24"/>
+          <w:szCs w:val="24"/>
+        </w:rPr>
+      </w:pPr>
+      <w:r>
+        <w:rPr>
+          <w:rFonts w:ascii="Times New Roman" w:hAnsi="Times New Roman" w:cs="Times New Roman"/>
+          <w:sz w:val="24"/>
+          <w:szCs w:val="24"/>
+        </w:rPr>
+        <w:t xml:space="preserve">In the few years the telecom industry has seen a lot of competition. Many companies are offering services at similar prices. This makes it hard for telecom companies to keep their customers. When customers leave it hurts the </w:t>
+      </w:r>
+      <w:proofErr w:type="spellStart"/>
+      <w:r>
+        <w:rPr>
+          <w:rFonts w:ascii="Times New Roman" w:hAnsi="Times New Roman" w:cs="Times New Roman"/>
+          <w:sz w:val="24"/>
+          <w:szCs w:val="24"/>
+        </w:rPr>
+        <w:t>companys</w:t>
+      </w:r>
+      <w:proofErr w:type="spellEnd"/>
+      <w:r>
+        <w:rPr>
+          <w:rFonts w:ascii="Times New Roman" w:hAnsi="Times New Roman" w:cs="Times New Roman"/>
+          <w:sz w:val="24"/>
+          <w:szCs w:val="24"/>
+        </w:rPr>
+        <w:t xml:space="preserve"> revenue. Makes it expensive to get new customers. </w:t>
+      </w:r>
+      <w:proofErr w:type="gramStart"/>
+      <w:r>
+        <w:rPr>
+          <w:rFonts w:ascii="Times New Roman" w:hAnsi="Times New Roman" w:cs="Times New Roman"/>
+          <w:sz w:val="24"/>
+          <w:szCs w:val="24"/>
+        </w:rPr>
+        <w:t>So</w:t>
+      </w:r>
+      <w:proofErr w:type="gramEnd"/>
+      <w:r>
+        <w:rPr>
+          <w:rFonts w:ascii="Times New Roman" w:hAnsi="Times New Roman" w:cs="Times New Roman"/>
+          <w:sz w:val="24"/>
+          <w:szCs w:val="24"/>
+        </w:rPr>
+        <w:t xml:space="preserve"> managing customer churn is a deal for telecom companies.</w:t>
+      </w:r>
+    </w:p>
+    <w:p>
+      <w:pPr>
+        <w:spacing w:after="420" w:line="240" w:lineRule="auto"/>
+        <w:ind w:left="515" w:hanging="10"/>
+        <w:rPr>
+          <w:rFonts w:ascii="Times New Roman" w:hAnsi="Times New Roman" w:cs="Times New Roman"/>
+          <w:sz w:val="24"/>
+          <w:szCs w:val="24"/>
+        </w:rPr>
+      </w:pPr>
+      <w:r>
+        <w:rPr>
+          <w:rFonts w:ascii="Times New Roman" w:hAnsi="Times New Roman" w:cs="Times New Roman"/>
+          <w:sz w:val="24"/>
+          <w:szCs w:val="24"/>
+        </w:rPr>
+        <w:t>The telecom industry gets a lot of data from customers. This data comes from billing systems customer support internet usage payment methods and service subscriptions. By using data analytics and machine learning we can look at this data. Find patterns in customer behavior. We can even predict when customers might leave.</w:t>
+      </w:r>
+    </w:p>
+    <w:p>
+      <w:pPr>
+        <w:spacing w:after="420" w:line="240" w:lineRule="auto"/>
+        <w:ind w:left="515" w:hanging="10"/>
+        <w:rPr>
+          <w:rFonts w:ascii="Times New Roman" w:hAnsi="Times New Roman" w:cs="Times New Roman"/>
+          <w:sz w:val="24"/>
+          <w:szCs w:val="24"/>
+        </w:rPr>
+      </w:pPr>
+      <w:r>
+        <w:rPr>
+          <w:rFonts w:ascii="Times New Roman" w:hAnsi="Times New Roman" w:cs="Times New Roman"/>
+          <w:sz w:val="24"/>
+          <w:szCs w:val="24"/>
+        </w:rPr>
+        <w:t xml:space="preserve">Predicting customer churn is an application of data science in the telecom industry. If telecom companies can find out which customers are likely to </w:t>
+      </w:r>
+      <w:proofErr w:type="gramStart"/>
+      <w:r>
+        <w:rPr>
+          <w:rFonts w:ascii="Times New Roman" w:hAnsi="Times New Roman" w:cs="Times New Roman"/>
+          <w:sz w:val="24"/>
+          <w:szCs w:val="24"/>
+        </w:rPr>
+        <w:t>leave</w:t>
+      </w:r>
+      <w:proofErr w:type="gramEnd"/>
+      <w:r>
+        <w:rPr>
+          <w:rFonts w:ascii="Times New Roman" w:hAnsi="Times New Roman" w:cs="Times New Roman"/>
+          <w:sz w:val="24"/>
+          <w:szCs w:val="24"/>
+        </w:rPr>
+        <w:t xml:space="preserve"> they can do something about it. They can offer discounts improve customer service or start loyalty programs.</w:t>
+      </w:r>
+    </w:p>
+    <w:p>
+      <w:pPr>
+        <w:spacing w:after="420" w:line="240" w:lineRule="auto"/>
+        <w:ind w:left="515" w:hanging="10"/>
+        <w:jc w:val="center"/>
+        <w:rPr>
+          <w:rFonts w:ascii="Times New Roman" w:hAnsi="Times New Roman" w:cs="Times New Roman"/>
+          <w:b/>
+          <w:bCs/>
+          <w:sz w:val="24"/>
+          <w:szCs w:val="24"/>
+        </w:rPr>
+      </w:pPr>
+      <w:r>
+        <w:rPr>
+          <w:rFonts w:ascii="Times New Roman" w:hAnsi="Times New Roman" w:cs="Times New Roman"/>
+          <w:b/>
+          <w:bCs/>
+          <w:sz w:val="24"/>
+          <w:szCs w:val="24"/>
+        </w:rPr>
+        <w:t>1.2 Introduction to Customer Churn</w:t>
+      </w:r>
+    </w:p>
+    <w:p>
+      <w:pPr>
+        <w:spacing w:after="420" w:line="240" w:lineRule="auto"/>
+        <w:ind w:left="515" w:hanging="10"/>
+        <w:rPr>
+          <w:rFonts w:ascii="Times New Roman" w:hAnsi="Times New Roman" w:cs="Times New Roman"/>
+          <w:sz w:val="24"/>
+          <w:szCs w:val="24"/>
+        </w:rPr>
+      </w:pPr>
+      <w:r>
+        <w:rPr>
+          <w:rFonts w:ascii="Times New Roman" w:hAnsi="Times New Roman" w:cs="Times New Roman"/>
+          <w:sz w:val="24"/>
+          <w:szCs w:val="24"/>
+        </w:rPr>
+        <w:t xml:space="preserve">Customer churn happens when customers stop using a </w:t>
+      </w:r>
+      <w:proofErr w:type="spellStart"/>
+      <w:r>
+        <w:rPr>
+          <w:rFonts w:ascii="Times New Roman" w:hAnsi="Times New Roman" w:cs="Times New Roman"/>
+          <w:sz w:val="24"/>
+          <w:szCs w:val="24"/>
+        </w:rPr>
+        <w:t>companys</w:t>
+      </w:r>
+      <w:proofErr w:type="spellEnd"/>
+      <w:r>
+        <w:rPr>
+          <w:rFonts w:ascii="Times New Roman" w:hAnsi="Times New Roman" w:cs="Times New Roman"/>
+          <w:sz w:val="24"/>
+          <w:szCs w:val="24"/>
+        </w:rPr>
+        <w:t xml:space="preserve"> services. In the telecom industry this happens when customers switch to a telecom company. They might do this because they are not happy with the service the price is too high or they got an offer from another company.</w:t>
+      </w:r>
+    </w:p>
+    <w:p>
+      <w:pPr>
+        <w:spacing w:after="420" w:line="240" w:lineRule="auto"/>
+        <w:ind w:left="515" w:hanging="10"/>
+        <w:rPr>
+          <w:rFonts w:ascii="Times New Roman" w:hAnsi="Times New Roman" w:cs="Times New Roman"/>
+          <w:sz w:val="24"/>
+          <w:szCs w:val="24"/>
+        </w:rPr>
+      </w:pPr>
+      <w:r>
+        <w:rPr>
+          <w:rFonts w:ascii="Times New Roman" w:hAnsi="Times New Roman" w:cs="Times New Roman"/>
+          <w:sz w:val="24"/>
+          <w:szCs w:val="24"/>
+        </w:rPr>
+        <w:t>There are two kinds of customer churn. One is when customers choose to leave because they are not happy with the service. The other is when the company has to stop the service because the customer did not pay their bill or broke the rules.</w:t>
+      </w:r>
+    </w:p>
+    <w:p>
+      <w:pPr>
+        <w:spacing w:after="420" w:line="240" w:lineRule="auto"/>
+        <w:ind w:left="515" w:hanging="10"/>
+        <w:rPr>
+          <w:rFonts w:ascii="Times New Roman" w:hAnsi="Times New Roman" w:cs="Times New Roman"/>
+          <w:sz w:val="24"/>
+          <w:szCs w:val="24"/>
+        </w:rPr>
+      </w:pPr>
+      <w:r>
+        <w:rPr>
+          <w:rFonts w:ascii="Times New Roman" w:hAnsi="Times New Roman" w:cs="Times New Roman"/>
+          <w:sz w:val="24"/>
+          <w:szCs w:val="24"/>
+        </w:rPr>
+        <w:t xml:space="preserve">If we can predict customer </w:t>
+      </w:r>
+      <w:proofErr w:type="gramStart"/>
+      <w:r>
+        <w:rPr>
+          <w:rFonts w:ascii="Times New Roman" w:hAnsi="Times New Roman" w:cs="Times New Roman"/>
+          <w:sz w:val="24"/>
+          <w:szCs w:val="24"/>
+        </w:rPr>
+        <w:t>churn</w:t>
+      </w:r>
+      <w:proofErr w:type="gramEnd"/>
+      <w:r>
+        <w:rPr>
+          <w:rFonts w:ascii="Times New Roman" w:hAnsi="Times New Roman" w:cs="Times New Roman"/>
+          <w:sz w:val="24"/>
+          <w:szCs w:val="24"/>
+        </w:rPr>
+        <w:t xml:space="preserve"> we can help companies keep their customers. By looking at how customers behave and how they use the service companies can make their customers happier. Reduce the amount of money they lose.</w:t>
+      </w:r>
+    </w:p>
+    <w:p>
+      <w:pPr>
+        <w:spacing w:after="420" w:line="240" w:lineRule="auto"/>
+        <w:ind w:left="515" w:hanging="10"/>
+        <w:rPr>
+          <w:rFonts w:ascii="Times New Roman" w:hAnsi="Times New Roman" w:cs="Times New Roman"/>
+          <w:sz w:val="24"/>
+          <w:szCs w:val="24"/>
+        </w:rPr>
+      </w:pPr>
+    </w:p>
+    <w:p>
+      <w:pPr>
+        <w:spacing w:after="420" w:line="240" w:lineRule="auto"/>
+        <w:ind w:left="515" w:hanging="10"/>
+        <w:rPr>
+          <w:rFonts w:ascii="Times New Roman" w:hAnsi="Times New Roman" w:cs="Times New Roman"/>
+          <w:sz w:val="24"/>
+          <w:szCs w:val="24"/>
+        </w:rPr>
+      </w:pPr>
+    </w:p>
+    <w:p>
+      <w:pPr>
+        <w:spacing w:after="420" w:line="240" w:lineRule="auto"/>
+        <w:ind w:left="515" w:hanging="10"/>
+        <w:jc w:val="center"/>
+        <w:rPr>
+          <w:rFonts w:ascii="Times New Roman" w:hAnsi="Times New Roman" w:cs="Times New Roman"/>
+          <w:b/>
+          <w:bCs/>
+          <w:sz w:val="24"/>
+          <w:szCs w:val="24"/>
+        </w:rPr>
+      </w:pPr>
+      <w:r>
+        <w:rPr>
+          <w:rFonts w:ascii="Times New Roman" w:hAnsi="Times New Roman" w:cs="Times New Roman"/>
+          <w:b/>
+          <w:bCs/>
+          <w:sz w:val="24"/>
+          <w:szCs w:val="24"/>
+        </w:rPr>
+        <w:lastRenderedPageBreak/>
+        <w:t>1.3 Overview of the Project</w:t>
+      </w:r>
+    </w:p>
+    <w:p>
+      <w:pPr>
+        <w:spacing w:after="420" w:line="240" w:lineRule="auto"/>
+        <w:ind w:left="515" w:hanging="10"/>
+        <w:rPr>
+          <w:rFonts w:ascii="Times New Roman" w:hAnsi="Times New Roman" w:cs="Times New Roman"/>
+          <w:b/>
+          <w:bCs/>
+          <w:sz w:val="24"/>
+          <w:szCs w:val="24"/>
+        </w:rPr>
+      </w:pPr>
+      <w:r>
+        <w:rPr>
+          <w:rFonts w:ascii="Times New Roman" w:hAnsi="Times New Roman" w:cs="Times New Roman"/>
+          <w:sz w:val="24"/>
+          <w:szCs w:val="24"/>
+        </w:rPr>
+        <w:t>This project is about using data analytics and machine learning to look at customer churn in the telecom industry. We are using a dataset that has information about customers like demographics account details and service usage.</w:t>
+      </w:r>
+    </w:p>
+    <w:p>
+      <w:pPr>
+        <w:spacing w:after="420" w:line="240" w:lineRule="auto"/>
+        <w:ind w:left="515" w:hanging="10"/>
+        <w:rPr>
+          <w:rFonts w:ascii="Times New Roman" w:hAnsi="Times New Roman" w:cs="Times New Roman"/>
+          <w:sz w:val="24"/>
+          <w:szCs w:val="24"/>
+        </w:rPr>
+      </w:pPr>
+      <w:r>
+        <w:rPr>
+          <w:rFonts w:ascii="Times New Roman" w:hAnsi="Times New Roman" w:cs="Times New Roman"/>
+          <w:sz w:val="24"/>
+          <w:szCs w:val="24"/>
+        </w:rPr>
+        <w:t>The main goal of this project is to find out what makes customers leave and to give telecom companies ideas on how to keep their customers. We are doing this by looking at the data doing analysis and making visualizations.</w:t>
+      </w:r>
+    </w:p>
+    <w:p>
+      <w:pPr>
+        <w:spacing w:after="420" w:line="240" w:lineRule="auto"/>
+        <w:ind w:left="515" w:hanging="10"/>
+        <w:rPr>
+          <w:rFonts w:ascii="Times New Roman" w:hAnsi="Times New Roman" w:cs="Times New Roman"/>
+          <w:sz w:val="24"/>
+          <w:szCs w:val="24"/>
+        </w:rPr>
+      </w:pPr>
+      <w:r>
+        <w:rPr>
+          <w:rFonts w:ascii="Times New Roman" w:hAnsi="Times New Roman" w:cs="Times New Roman"/>
+          <w:sz w:val="24"/>
+          <w:szCs w:val="24"/>
+        </w:rPr>
+        <w:t>We are also trying to identify patterns in customer behavior and give business recommendations. We used graphs and statistical methods to understand customer behavior and find patterns that are related to churn.</w:t>
+      </w:r>
+    </w:p>
+    <w:p>
+      <w:pPr>
+        <w:spacing w:after="420" w:line="240" w:lineRule="auto"/>
+        <w:ind w:left="515" w:hanging="10"/>
+        <w:jc w:val="center"/>
+        <w:rPr>
+          <w:rFonts w:ascii="Times New Roman" w:hAnsi="Times New Roman" w:cs="Times New Roman"/>
+          <w:b/>
+          <w:bCs/>
+          <w:sz w:val="24"/>
+          <w:szCs w:val="24"/>
+        </w:rPr>
+      </w:pPr>
+      <w:r>
+        <w:rPr>
+          <w:rFonts w:ascii="Times New Roman" w:hAnsi="Times New Roman" w:cs="Times New Roman"/>
+          <w:b/>
+          <w:bCs/>
+          <w:sz w:val="24"/>
+          <w:szCs w:val="24"/>
+        </w:rPr>
+        <w:t>1.4 Importance of Customer Churn Analysis</w:t>
+      </w:r>
+    </w:p>
+    <w:p>
+      <w:pPr>
+        <w:spacing w:after="420" w:line="240" w:lineRule="auto"/>
+        <w:ind w:left="515" w:hanging="10"/>
+        <w:rPr>
+          <w:rFonts w:ascii="Times New Roman" w:hAnsi="Times New Roman" w:cs="Times New Roman"/>
+          <w:sz w:val="24"/>
+          <w:szCs w:val="24"/>
+        </w:rPr>
+      </w:pPr>
+      <w:r>
+        <w:rPr>
+          <w:rFonts w:ascii="Times New Roman" w:hAnsi="Times New Roman" w:cs="Times New Roman"/>
+          <w:sz w:val="24"/>
+          <w:szCs w:val="24"/>
+        </w:rPr>
+        <w:t xml:space="preserve">It is cheaper to keep customers than to get ones. </w:t>
+      </w:r>
+      <w:proofErr w:type="gramStart"/>
+      <w:r>
+        <w:rPr>
+          <w:rFonts w:ascii="Times New Roman" w:hAnsi="Times New Roman" w:cs="Times New Roman"/>
+          <w:sz w:val="24"/>
+          <w:szCs w:val="24"/>
+        </w:rPr>
+        <w:t>So</w:t>
+      </w:r>
+      <w:proofErr w:type="gramEnd"/>
+      <w:r>
+        <w:rPr>
+          <w:rFonts w:ascii="Times New Roman" w:hAnsi="Times New Roman" w:cs="Times New Roman"/>
+          <w:sz w:val="24"/>
+          <w:szCs w:val="24"/>
+        </w:rPr>
+        <w:t xml:space="preserve"> understanding why customers leave is really important for telecom companies.</w:t>
+      </w:r>
+    </w:p>
+    <w:p>
+      <w:pPr>
+        <w:spacing w:after="420" w:line="240" w:lineRule="auto"/>
+        <w:ind w:left="515" w:hanging="10"/>
+        <w:rPr>
+          <w:rFonts w:ascii="Times New Roman" w:hAnsi="Times New Roman" w:cs="Times New Roman"/>
+          <w:sz w:val="24"/>
+          <w:szCs w:val="24"/>
+        </w:rPr>
+      </w:pPr>
+      <w:r>
+        <w:rPr>
+          <w:rFonts w:ascii="Times New Roman" w:hAnsi="Times New Roman" w:cs="Times New Roman"/>
+          <w:sz w:val="24"/>
+          <w:szCs w:val="24"/>
+        </w:rPr>
+        <w:t xml:space="preserve">If we can analyze customer </w:t>
+      </w:r>
+      <w:proofErr w:type="gramStart"/>
+      <w:r>
+        <w:rPr>
+          <w:rFonts w:ascii="Times New Roman" w:hAnsi="Times New Roman" w:cs="Times New Roman"/>
+          <w:sz w:val="24"/>
+          <w:szCs w:val="24"/>
+        </w:rPr>
+        <w:t>churn</w:t>
+      </w:r>
+      <w:proofErr w:type="gramEnd"/>
+      <w:r>
+        <w:rPr>
+          <w:rFonts w:ascii="Times New Roman" w:hAnsi="Times New Roman" w:cs="Times New Roman"/>
+          <w:sz w:val="24"/>
+          <w:szCs w:val="24"/>
+        </w:rPr>
+        <w:t xml:space="preserve"> we can help companies reduce the number of customers they lose make their customers happier and increase their profits in the run. We can also help them make pricing plans improve their service quality and create personalized plans to keep customers.</w:t>
+      </w:r>
+    </w:p>
+    <w:p>
+      <w:pPr>
+        <w:spacing w:after="420" w:line="240" w:lineRule="auto"/>
+        <w:ind w:left="515" w:hanging="10"/>
+        <w:rPr>
+          <w:rFonts w:ascii="Times New Roman" w:hAnsi="Times New Roman" w:cs="Times New Roman"/>
+          <w:sz w:val="24"/>
+          <w:szCs w:val="24"/>
+        </w:rPr>
+      </w:pPr>
+      <w:r>
+        <w:rPr>
+          <w:rFonts w:ascii="Times New Roman" w:hAnsi="Times New Roman" w:cs="Times New Roman"/>
+          <w:sz w:val="24"/>
+          <w:szCs w:val="24"/>
+        </w:rPr>
+        <w:t xml:space="preserve">In a market even a small reduction in customer churn can make a big difference in a </w:t>
+      </w:r>
+      <w:proofErr w:type="spellStart"/>
+      <w:r>
+        <w:rPr>
+          <w:rFonts w:ascii="Times New Roman" w:hAnsi="Times New Roman" w:cs="Times New Roman"/>
+          <w:sz w:val="24"/>
+          <w:szCs w:val="24"/>
+        </w:rPr>
+        <w:t>companys</w:t>
+      </w:r>
+      <w:proofErr w:type="spellEnd"/>
+      <w:r>
+        <w:rPr>
+          <w:rFonts w:ascii="Times New Roman" w:hAnsi="Times New Roman" w:cs="Times New Roman"/>
+          <w:sz w:val="24"/>
+          <w:szCs w:val="24"/>
+        </w:rPr>
+        <w:t xml:space="preserve"> revenue and customer lifetime value.</w:t>
+      </w:r>
+    </w:p>
+    <w:p>
+      <w:pPr>
+        <w:spacing w:after="420" w:line="240" w:lineRule="auto"/>
+        <w:ind w:left="515" w:hanging="10"/>
+        <w:jc w:val="center"/>
+        <w:rPr>
+          <w:rFonts w:ascii="Times New Roman" w:hAnsi="Times New Roman" w:cs="Times New Roman"/>
+          <w:b/>
+          <w:bCs/>
+          <w:sz w:val="24"/>
+          <w:szCs w:val="24"/>
+        </w:rPr>
+      </w:pPr>
+      <w:r>
+        <w:rPr>
+          <w:rFonts w:ascii="Times New Roman" w:hAnsi="Times New Roman" w:cs="Times New Roman"/>
+          <w:b/>
+          <w:bCs/>
+          <w:sz w:val="24"/>
+          <w:szCs w:val="24"/>
+        </w:rPr>
+        <w:t>1.5 Role of Data Analytics and Machine Learning</w:t>
+      </w:r>
+    </w:p>
+    <w:p>
+      <w:pPr>
+        <w:spacing w:after="420" w:line="240" w:lineRule="auto"/>
+        <w:ind w:left="515" w:hanging="10"/>
+        <w:rPr>
+          <w:rFonts w:ascii="Times New Roman" w:hAnsi="Times New Roman" w:cs="Times New Roman"/>
+          <w:sz w:val="24"/>
+          <w:szCs w:val="24"/>
+        </w:rPr>
+      </w:pPr>
+      <w:r>
+        <w:rPr>
+          <w:rFonts w:ascii="Times New Roman" w:hAnsi="Times New Roman" w:cs="Times New Roman"/>
+          <w:sz w:val="24"/>
+          <w:szCs w:val="24"/>
+        </w:rPr>
+        <w:t>Data analytics and machine learning have changed the way businesses make decisions. Now companies use data to make plans of just guessing.</w:t>
+      </w:r>
+    </w:p>
+    <w:p>
+      <w:pPr>
+        <w:spacing w:after="420" w:line="240" w:lineRule="auto"/>
+        <w:ind w:left="515" w:hanging="10"/>
+        <w:rPr>
+          <w:rFonts w:ascii="Times New Roman" w:hAnsi="Times New Roman" w:cs="Times New Roman"/>
+          <w:sz w:val="24"/>
+          <w:szCs w:val="24"/>
+        </w:rPr>
+      </w:pPr>
+      <w:r>
+        <w:rPr>
+          <w:rFonts w:ascii="Times New Roman" w:hAnsi="Times New Roman" w:cs="Times New Roman"/>
+          <w:sz w:val="24"/>
+          <w:szCs w:val="24"/>
+        </w:rPr>
+        <w:t>Machine learning algorithms can look at datasets find patterns and predict what might happen in the future. In the telecom industry machine learning can help us find out which customers are most likely to leave.</w:t>
+      </w:r>
+    </w:p>
+    <w:p>
+      <w:pPr>
+        <w:spacing w:after="420" w:line="240" w:lineRule="auto"/>
+        <w:ind w:left="515" w:hanging="10"/>
+        <w:rPr>
+          <w:rFonts w:ascii="Times New Roman" w:hAnsi="Times New Roman" w:cs="Times New Roman"/>
+          <w:sz w:val="24"/>
+          <w:szCs w:val="24"/>
+        </w:rPr>
+      </w:pPr>
+      <w:r>
+        <w:rPr>
+          <w:rFonts w:ascii="Times New Roman" w:hAnsi="Times New Roman" w:cs="Times New Roman"/>
+          <w:sz w:val="24"/>
+          <w:szCs w:val="24"/>
+        </w:rPr>
+        <w:t>In this project we used analytical techniques like correlation analysis distribution analysis and hypothesis testing to understand customer churn behavior and get useful business insights.</w:t>
+      </w:r>
+    </w:p>
+    <w:p>
+      <w:pPr>
+        <w:spacing w:after="420" w:line="240" w:lineRule="auto"/>
+        <w:ind w:left="515" w:hanging="10"/>
+        <w:jc w:val="center"/>
+        <w:rPr>
+          <w:rFonts w:ascii="Times New Roman" w:hAnsi="Times New Roman" w:cs="Times New Roman"/>
+          <w:b/>
+          <w:bCs/>
+          <w:sz w:val="24"/>
+          <w:szCs w:val="24"/>
+        </w:rPr>
+      </w:pPr>
+      <w:r>
+        <w:rPr>
+          <w:rFonts w:ascii="Times New Roman" w:hAnsi="Times New Roman" w:cs="Times New Roman"/>
+          <w:b/>
+          <w:bCs/>
+          <w:sz w:val="24"/>
+          <w:szCs w:val="24"/>
+        </w:rPr>
+        <w:t>1.6 Problem Statement</w:t>
+      </w:r>
+    </w:p>
+    <w:p>
+      <w:pPr>
+        <w:spacing w:after="420" w:line="240" w:lineRule="auto"/>
+        <w:ind w:left="515" w:hanging="10"/>
+        <w:rPr>
+          <w:rFonts w:ascii="Times New Roman" w:hAnsi="Times New Roman" w:cs="Times New Roman"/>
+          <w:sz w:val="24"/>
+          <w:szCs w:val="24"/>
+        </w:rPr>
+      </w:pPr>
+      <w:r>
+        <w:rPr>
+          <w:rFonts w:ascii="Times New Roman" w:hAnsi="Times New Roman" w:cs="Times New Roman"/>
+          <w:sz w:val="24"/>
+          <w:szCs w:val="24"/>
+        </w:rPr>
+        <w:t>Customer churn is a big problem in the telecom industry. When customers leave companies lose money. It is hard to figure out why customers leave because there are reasons like pricing contract type and service quality.</w:t>
+      </w:r>
+    </w:p>
+    <w:p>
+      <w:pPr>
+        <w:spacing w:after="420" w:line="240" w:lineRule="auto"/>
+        <w:ind w:left="515" w:hanging="10"/>
+        <w:rPr>
+          <w:rFonts w:ascii="Times New Roman" w:hAnsi="Times New Roman" w:cs="Times New Roman"/>
+          <w:sz w:val="24"/>
+          <w:szCs w:val="24"/>
+        </w:rPr>
+      </w:pPr>
+      <w:r>
+        <w:rPr>
+          <w:rFonts w:ascii="Times New Roman" w:hAnsi="Times New Roman" w:cs="Times New Roman"/>
+          <w:sz w:val="24"/>
+          <w:szCs w:val="24"/>
+        </w:rPr>
+        <w:lastRenderedPageBreak/>
+        <w:t>This study is trying to look at telecom customer data to find out what makes customers leave and to give recommendations that can help reduce customer churn.</w:t>
+      </w:r>
+    </w:p>
+    <w:p>
+      <w:pPr>
+        <w:spacing w:after="420" w:line="240" w:lineRule="auto"/>
+        <w:ind w:left="515" w:hanging="10"/>
+        <w:jc w:val="center"/>
+        <w:rPr>
+          <w:rFonts w:ascii="Times New Roman" w:hAnsi="Times New Roman" w:cs="Times New Roman"/>
+          <w:b/>
+          <w:bCs/>
+          <w:sz w:val="24"/>
+          <w:szCs w:val="24"/>
+        </w:rPr>
+      </w:pPr>
+      <w:r>
+        <w:rPr>
+          <w:rFonts w:ascii="Times New Roman" w:hAnsi="Times New Roman" w:cs="Times New Roman"/>
+          <w:b/>
+          <w:bCs/>
+          <w:sz w:val="24"/>
+          <w:szCs w:val="24"/>
+        </w:rPr>
+        <w:t>1.7 Need for the Study</w:t>
+      </w:r>
+    </w:p>
+    <w:p>
+      <w:pPr>
+        <w:spacing w:after="420" w:line="240" w:lineRule="auto"/>
+        <w:ind w:left="515" w:hanging="10"/>
+        <w:rPr>
+          <w:rFonts w:ascii="Times New Roman" w:hAnsi="Times New Roman" w:cs="Times New Roman"/>
+          <w:sz w:val="24"/>
+          <w:szCs w:val="24"/>
+        </w:rPr>
+      </w:pPr>
+      <w:r>
+        <w:rPr>
+          <w:rFonts w:ascii="Times New Roman" w:hAnsi="Times New Roman" w:cs="Times New Roman"/>
+          <w:sz w:val="24"/>
+          <w:szCs w:val="24"/>
+        </w:rPr>
+        <w:t>The telecom industry is very competitive. Companies need to keep their customers. They need analytical methods to understand customer behavior and reduce churn.</w:t>
+      </w:r>
+    </w:p>
+    <w:p>
+      <w:pPr>
+        <w:spacing w:after="420" w:line="240" w:lineRule="auto"/>
+        <w:ind w:left="515" w:hanging="10"/>
+        <w:rPr>
+          <w:rFonts w:ascii="Times New Roman" w:hAnsi="Times New Roman" w:cs="Times New Roman"/>
+          <w:sz w:val="24"/>
+          <w:szCs w:val="24"/>
+        </w:rPr>
+      </w:pPr>
+      <w:r>
+        <w:rPr>
+          <w:rFonts w:ascii="Times New Roman" w:hAnsi="Times New Roman" w:cs="Times New Roman"/>
+          <w:sz w:val="24"/>
+          <w:szCs w:val="24"/>
+        </w:rPr>
+        <w:t>We need this study because it can help companies keep their customers reduce the cost of getting customers and use the customer data they have to make better decisions.</w:t>
+      </w:r>
+    </w:p>
+    <w:p>
+      <w:pPr>
+        <w:spacing w:after="420" w:line="240" w:lineRule="auto"/>
+        <w:ind w:left="515" w:hanging="10"/>
+        <w:jc w:val="center"/>
+        <w:rPr>
+          <w:rFonts w:ascii="Times New Roman" w:hAnsi="Times New Roman" w:cs="Times New Roman"/>
+          <w:b/>
+          <w:bCs/>
+          <w:sz w:val="24"/>
+          <w:szCs w:val="24"/>
+        </w:rPr>
+      </w:pPr>
+      <w:r>
+        <w:rPr>
+          <w:rFonts w:ascii="Times New Roman" w:hAnsi="Times New Roman" w:cs="Times New Roman"/>
+          <w:b/>
+          <w:bCs/>
+          <w:sz w:val="24"/>
+          <w:szCs w:val="24"/>
+        </w:rPr>
+        <w:t>1.8 Relevance to MBA Specialization</w:t>
+      </w:r>
+    </w:p>
+    <w:p>
+      <w:pPr>
+        <w:spacing w:after="420" w:line="240" w:lineRule="auto"/>
+        <w:ind w:left="515" w:hanging="10"/>
+        <w:rPr>
+          <w:rFonts w:ascii="Times New Roman" w:hAnsi="Times New Roman" w:cs="Times New Roman"/>
+          <w:sz w:val="24"/>
+          <w:szCs w:val="24"/>
+        </w:rPr>
+      </w:pPr>
+      <w:r>
+        <w:rPr>
+          <w:rFonts w:ascii="Times New Roman" w:hAnsi="Times New Roman" w:cs="Times New Roman"/>
+          <w:sz w:val="24"/>
+          <w:szCs w:val="24"/>
+        </w:rPr>
+        <w:t>This project is related to MBA areas like Business Analytics Marketing and Operations Management.</w:t>
+      </w:r>
+    </w:p>
+    <w:p>
+      <w:pPr>
+        <w:spacing w:after="420" w:line="240" w:lineRule="auto"/>
+        <w:ind w:left="515" w:hanging="10"/>
+        <w:rPr>
+          <w:rFonts w:ascii="Times New Roman" w:hAnsi="Times New Roman" w:cs="Times New Roman"/>
+          <w:sz w:val="24"/>
+          <w:szCs w:val="24"/>
+        </w:rPr>
+      </w:pPr>
+      <w:r>
+        <w:rPr>
+          <w:rFonts w:ascii="Times New Roman" w:hAnsi="Times New Roman" w:cs="Times New Roman"/>
+          <w:sz w:val="24"/>
+          <w:szCs w:val="24"/>
+        </w:rPr>
+        <w:t>From a business analytics perspective this project shows how to use techniques visualization tools and machine learning concepts to make business decisions.</w:t>
+      </w:r>
+    </w:p>
+    <w:p>
+      <w:pPr>
+        <w:spacing w:after="420" w:line="240" w:lineRule="auto"/>
+        <w:ind w:left="515" w:hanging="10"/>
+        <w:rPr>
+          <w:rFonts w:ascii="Times New Roman" w:hAnsi="Times New Roman" w:cs="Times New Roman"/>
+          <w:sz w:val="24"/>
+          <w:szCs w:val="24"/>
+        </w:rPr>
+      </w:pPr>
+      <w:r>
+        <w:rPr>
+          <w:rFonts w:ascii="Times New Roman" w:hAnsi="Times New Roman" w:cs="Times New Roman"/>
+          <w:sz w:val="24"/>
+          <w:szCs w:val="24"/>
+        </w:rPr>
+        <w:t>From a marketing perspective this study helps us understand customer behavior retention strategies and customer relationship management.</w:t>
+      </w:r>
+    </w:p>
+    <w:p>
+      <w:pPr>
+        <w:spacing w:after="420" w:line="240" w:lineRule="auto"/>
+        <w:ind w:left="515" w:hanging="10"/>
+        <w:rPr>
+          <w:rFonts w:ascii="Times New Roman" w:hAnsi="Times New Roman" w:cs="Times New Roman"/>
+          <w:sz w:val="24"/>
+          <w:szCs w:val="24"/>
+        </w:rPr>
+      </w:pPr>
+      <w:r>
+        <w:rPr>
+          <w:rFonts w:ascii="Times New Roman" w:hAnsi="Times New Roman" w:cs="Times New Roman"/>
+          <w:sz w:val="24"/>
+          <w:szCs w:val="24"/>
+        </w:rPr>
+        <w:t>This project also shows how important it is to use data to make decisions in business and gives experience with analytical thinking and business intelligence tools.</w:t>
+      </w:r>
+    </w:p>
+    <w:p>
+      <w:pPr>
+        <w:spacing w:after="420" w:line="240" w:lineRule="auto"/>
+        <w:ind w:left="515" w:hanging="10"/>
+        <w:jc w:val="center"/>
+        <w:rPr>
+          <w:rFonts w:ascii="Times New Roman" w:hAnsi="Times New Roman" w:cs="Times New Roman"/>
+          <w:b/>
+          <w:bCs/>
+          <w:sz w:val="24"/>
+          <w:szCs w:val="24"/>
+        </w:rPr>
+      </w:pPr>
+      <w:r>
+        <w:rPr>
+          <w:rFonts w:ascii="Times New Roman" w:hAnsi="Times New Roman" w:cs="Times New Roman"/>
+          <w:b/>
+          <w:bCs/>
+          <w:sz w:val="24"/>
+          <w:szCs w:val="24"/>
+        </w:rPr>
+        <w:t>1.9 Chapter Summary</w:t>
+      </w:r>
+    </w:p>
+    <w:p>
+      <w:pPr>
+        <w:spacing w:after="420" w:line="240" w:lineRule="auto"/>
+        <w:ind w:left="515" w:hanging="10"/>
+        <w:rPr>
+          <w:rFonts w:ascii="Times New Roman" w:hAnsi="Times New Roman" w:cs="Times New Roman"/>
+          <w:sz w:val="24"/>
+          <w:szCs w:val="24"/>
+        </w:rPr>
+      </w:pPr>
+      <w:r>
+        <w:rPr>
+          <w:rFonts w:ascii="Times New Roman" w:hAnsi="Times New Roman" w:cs="Times New Roman"/>
+          <w:sz w:val="24"/>
+          <w:szCs w:val="24"/>
+        </w:rPr>
+        <w:t>This chapter introduced the telecom industry customer churn and the importance of predicting customer churn. It also talked about the role of data analytics and machine learning in solving customer retention challenges. The chapter explained the need for the study the problem statement and how the project is related to MBA specialization areas.</w:t>
+      </w:r>
+    </w:p>
+    <w:p>
+      <w:pPr>
+        <w:spacing w:after="420" w:line="240" w:lineRule="auto"/>
+        <w:ind w:left="515" w:hanging="10"/>
+        <w:rPr>
+          <w:rFonts w:ascii="Times New Roman" w:hAnsi="Times New Roman" w:cs="Times New Roman"/>
+          <w:sz w:val="24"/>
+          <w:szCs w:val="24"/>
+        </w:rPr>
+      </w:pPr>
+      <w:r>
+        <w:rPr>
+          <w:rFonts w:ascii="Times New Roman" w:hAnsi="Times New Roman" w:cs="Times New Roman"/>
+          <w:sz w:val="24"/>
+          <w:szCs w:val="24"/>
+        </w:rPr>
+        <w:t>The next chapter will talk about the objectives scope and purpose of the study.</w:t>
+      </w:r>
+    </w:p>
+    <w:p>
+      <w:pPr>
+        <w:spacing w:after="420" w:line="240" w:lineRule="auto"/>
+        <w:ind w:left="515" w:hanging="10"/>
+        <w:rPr>
+          <w:rFonts w:ascii="Times New Roman" w:hAnsi="Times New Roman" w:cs="Times New Roman"/>
+          <w:sz w:val="24"/>
+          <w:szCs w:val="24"/>
+        </w:rPr>
+      </w:pPr>
+    </w:p>
+    <w:p>
+      <w:pPr>
+        <w:spacing w:after="420" w:line="240" w:lineRule="auto"/>
+        <w:ind w:left="515" w:hanging="10"/>
+        <w:jc w:val="center"/>
+        <w:rPr>
+          <w:rFonts w:ascii="Times New Roman" w:hAnsi="Times New Roman" w:cs="Times New Roman"/>
+          <w:b/>
+          <w:bCs/>
+          <w:sz w:val="28"/>
+          <w:szCs w:val="28"/>
+        </w:rPr>
+      </w:pPr>
+      <w:r>
+        <w:rPr>
+          <w:rFonts w:ascii="Times New Roman" w:hAnsi="Times New Roman" w:cs="Times New Roman"/>
+          <w:b/>
+          <w:bCs/>
+          <w:sz w:val="28"/>
+          <w:szCs w:val="28"/>
+        </w:rPr>
+        <w:t>CHAPTER II</w:t>
+      </w:r>
+    </w:p>
+    <w:p>
+      <w:pPr>
+        <w:spacing w:after="420" w:line="240" w:lineRule="auto"/>
+        <w:ind w:left="515" w:hanging="10"/>
+        <w:jc w:val="center"/>
+        <w:rPr>
+          <w:rFonts w:ascii="Times New Roman" w:hAnsi="Times New Roman" w:cs="Times New Roman"/>
+          <w:b/>
+          <w:bCs/>
+          <w:sz w:val="28"/>
+          <w:szCs w:val="28"/>
+        </w:rPr>
+      </w:pPr>
+      <w:r>
+        <w:rPr>
+          <w:rFonts w:ascii="Times New Roman" w:hAnsi="Times New Roman" w:cs="Times New Roman"/>
+          <w:b/>
+          <w:bCs/>
+          <w:sz w:val="28"/>
+          <w:szCs w:val="28"/>
+        </w:rPr>
+        <w:t>Objective, Scope &amp;</w:t>
+      </w:r>
+      <w:r>
+        <w:rPr>
+          <w:rFonts w:ascii="Times New Roman" w:hAnsi="Times New Roman" w:cs="Times New Roman"/>
+          <w:b/>
+          <w:bCs/>
+          <w:sz w:val="28"/>
+          <w:szCs w:val="28"/>
+        </w:rPr>
+        <w:t xml:space="preserve"> Purpose OF THE STUDY</w:t>
+      </w:r>
+    </w:p>
+    <w:p>
+      <w:pPr>
+        <w:spacing w:after="420" w:line="240" w:lineRule="auto"/>
+        <w:ind w:left="515" w:hanging="10"/>
+        <w:jc w:val="center"/>
+        <w:rPr>
+          <w:rFonts w:ascii="Times New Roman" w:hAnsi="Times New Roman" w:cs="Times New Roman"/>
+          <w:sz w:val="24"/>
+          <w:szCs w:val="24"/>
+        </w:rPr>
+      </w:pPr>
+      <w:r>
+        <w:rPr>
+          <w:rFonts w:ascii="Times New Roman" w:hAnsi="Times New Roman" w:cs="Times New Roman"/>
+          <w:sz w:val="24"/>
+          <w:szCs w:val="24"/>
+        </w:rPr>
+        <w:t>---</w:t>
+      </w:r>
+    </w:p>
+    <w:p>
+      <w:pPr>
+        <w:spacing w:after="420" w:line="240" w:lineRule="auto"/>
+        <w:ind w:left="515" w:hanging="10"/>
+        <w:jc w:val="center"/>
+        <w:rPr>
+          <w:rFonts w:ascii="Times New Roman" w:hAnsi="Times New Roman" w:cs="Times New Roman"/>
+          <w:b/>
+          <w:bCs/>
+          <w:sz w:val="24"/>
+          <w:szCs w:val="24"/>
+        </w:rPr>
+      </w:pPr>
+      <w:r>
+        <w:rPr>
+          <w:rFonts w:ascii="Times New Roman" w:hAnsi="Times New Roman" w:cs="Times New Roman"/>
+          <w:b/>
+          <w:bCs/>
+          <w:sz w:val="24"/>
+          <w:szCs w:val="24"/>
+        </w:rPr>
+        <w:t>2.1 Purpose of the Research</w:t>
+      </w:r>
+    </w:p>
+    <w:p>
+      <w:pPr>
+        <w:spacing w:after="420" w:line="240" w:lineRule="auto"/>
+        <w:ind w:left="515" w:hanging="10"/>
+        <w:rPr>
+          <w:rFonts w:ascii="Times New Roman" w:hAnsi="Times New Roman" w:cs="Times New Roman"/>
+          <w:sz w:val="24"/>
+          <w:szCs w:val="24"/>
+        </w:rPr>
+      </w:pPr>
+    </w:p>
+    <w:p>
+      <w:pPr>
+        <w:spacing w:after="420" w:line="240" w:lineRule="auto"/>
+        <w:ind w:left="515" w:hanging="10"/>
+        <w:rPr>
+          <w:rFonts w:ascii="Times New Roman" w:hAnsi="Times New Roman" w:cs="Times New Roman"/>
+          <w:sz w:val="24"/>
+          <w:szCs w:val="24"/>
+        </w:rPr>
+      </w:pPr>
+      <w:r>
+        <w:rPr>
+          <w:rFonts w:ascii="Times New Roman" w:hAnsi="Times New Roman" w:cs="Times New Roman"/>
+          <w:sz w:val="24"/>
+          <w:szCs w:val="24"/>
+        </w:rPr>
+        <w:t>The main purpose of this research is to understand customer churn in the telecom industry. We want to use data analytics and machine learning techniques to find out why customers leave telecom services. This study looks at customer behavior to identify patterns and important factors that influence customer churn.</w:t>
+      </w:r>
+    </w:p>
+    <w:p>
+      <w:pPr>
+        <w:spacing w:after="420" w:line="240" w:lineRule="auto"/>
+        <w:ind w:left="515" w:hanging="10"/>
+        <w:rPr>
+          <w:rFonts w:ascii="Times New Roman" w:hAnsi="Times New Roman" w:cs="Times New Roman"/>
+          <w:sz w:val="24"/>
+          <w:szCs w:val="24"/>
+        </w:rPr>
+      </w:pPr>
+      <w:r>
+        <w:rPr>
+          <w:rFonts w:ascii="Times New Roman" w:hAnsi="Times New Roman" w:cs="Times New Roman"/>
+          <w:sz w:val="24"/>
+          <w:szCs w:val="24"/>
+        </w:rPr>
+        <w:t>Customer churn in the telecom industry is what we are trying to understand. We use customer data to understand what customers do. Why they leave. This helps companies improve their services and keep customers.</w:t>
+      </w:r>
+    </w:p>
+    <w:p>
+      <w:pPr>
+        <w:spacing w:after="420" w:line="240" w:lineRule="auto"/>
+        <w:ind w:left="515" w:hanging="10"/>
+        <w:rPr>
+          <w:rFonts w:ascii="Times New Roman" w:hAnsi="Times New Roman" w:cs="Times New Roman"/>
+          <w:sz w:val="24"/>
+          <w:szCs w:val="24"/>
+        </w:rPr>
+      </w:pPr>
+      <w:r>
+        <w:rPr>
+          <w:rFonts w:ascii="Times New Roman" w:hAnsi="Times New Roman" w:cs="Times New Roman"/>
+          <w:sz w:val="24"/>
+          <w:szCs w:val="24"/>
+        </w:rPr>
+        <w:t>In this project we look at customer data in a way to find out why customers stop using telecom services.</w:t>
+      </w:r>
+    </w:p>
+    <w:p>
+      <w:pPr>
+        <w:spacing w:after="420" w:line="240" w:lineRule="auto"/>
+        <w:ind w:left="515" w:hanging="10"/>
+        <w:rPr>
+          <w:rFonts w:ascii="Times New Roman" w:hAnsi="Times New Roman" w:cs="Times New Roman"/>
+          <w:sz w:val="24"/>
+          <w:szCs w:val="24"/>
+        </w:rPr>
+      </w:pPr>
+      <w:r>
+        <w:rPr>
+          <w:rFonts w:ascii="Times New Roman" w:hAnsi="Times New Roman" w:cs="Times New Roman"/>
+          <w:sz w:val="24"/>
+          <w:szCs w:val="24"/>
+        </w:rPr>
+        <w:t>This research also helps us understand how things like charges and contract type and internet services and payment methods and tenure affect customer churn in the telecom industry. By looking at these things telecom companies can make decisions. Keep more customers.</w:t>
+      </w:r>
+    </w:p>
+    <w:p>
+      <w:pPr>
+        <w:spacing w:after="420" w:line="240" w:lineRule="auto"/>
+        <w:ind w:left="515" w:hanging="10"/>
+        <w:rPr>
+          <w:rFonts w:ascii="Times New Roman" w:hAnsi="Times New Roman" w:cs="Times New Roman"/>
+          <w:sz w:val="24"/>
+          <w:szCs w:val="24"/>
+        </w:rPr>
+      </w:pPr>
+      <w:r>
+        <w:rPr>
+          <w:rFonts w:ascii="Times New Roman" w:hAnsi="Times New Roman" w:cs="Times New Roman"/>
+          <w:sz w:val="24"/>
+          <w:szCs w:val="24"/>
+        </w:rPr>
+        <w:t>The purpose of this study is not just to learn but to help telecom companies improve customer satisfaction and make money and keep customers.</w:t>
+      </w:r>
+    </w:p>
+    <w:p>
+      <w:pPr>
+        <w:spacing w:after="420" w:line="240" w:lineRule="auto"/>
+        <w:ind w:left="515" w:hanging="10"/>
+        <w:jc w:val="center"/>
+        <w:rPr>
+          <w:rFonts w:ascii="Times New Roman" w:hAnsi="Times New Roman" w:cs="Times New Roman"/>
+          <w:sz w:val="24"/>
+          <w:szCs w:val="24"/>
+        </w:rPr>
+      </w:pPr>
+      <w:r>
+        <w:rPr>
+          <w:rFonts w:ascii="Times New Roman" w:hAnsi="Times New Roman" w:cs="Times New Roman"/>
+          <w:sz w:val="24"/>
+          <w:szCs w:val="24"/>
+        </w:rPr>
+        <w:t>---</w:t>
+      </w:r>
+    </w:p>
+    <w:p>
+      <w:pPr>
+        <w:spacing w:after="420" w:line="240" w:lineRule="auto"/>
+        <w:ind w:left="515" w:hanging="10"/>
+        <w:jc w:val="center"/>
+        <w:rPr>
+          <w:rFonts w:ascii="Times New Roman" w:hAnsi="Times New Roman" w:cs="Times New Roman"/>
+          <w:b/>
+          <w:bCs/>
+          <w:sz w:val="24"/>
+          <w:szCs w:val="24"/>
+        </w:rPr>
+      </w:pPr>
+      <w:r>
+        <w:rPr>
+          <w:rFonts w:ascii="Times New Roman" w:hAnsi="Times New Roman" w:cs="Times New Roman"/>
+          <w:b/>
+          <w:bCs/>
+          <w:sz w:val="24"/>
+          <w:szCs w:val="24"/>
+        </w:rPr>
+        <w:t>2.2 Objectives of the Study</w:t>
+      </w:r>
+    </w:p>
+    <w:p>
+      <w:pPr>
+        <w:spacing w:after="420" w:line="240" w:lineRule="auto"/>
+        <w:ind w:left="515" w:hanging="10"/>
+        <w:rPr>
+          <w:rFonts w:ascii="Times New Roman" w:hAnsi="Times New Roman" w:cs="Times New Roman"/>
+          <w:sz w:val="24"/>
+          <w:szCs w:val="24"/>
+        </w:rPr>
+      </w:pPr>
+      <w:r>
+        <w:rPr>
+          <w:rFonts w:ascii="Times New Roman" w:hAnsi="Times New Roman" w:cs="Times New Roman"/>
+          <w:sz w:val="24"/>
+          <w:szCs w:val="24"/>
+        </w:rPr>
+        <w:t>The objectives of this project are as follows</w:t>
+      </w:r>
+    </w:p>
+    <w:p>
+      <w:pPr>
+        <w:spacing w:after="420" w:line="240" w:lineRule="auto"/>
+        <w:ind w:left="515" w:hanging="10"/>
+        <w:rPr>
+          <w:rFonts w:ascii="Times New Roman" w:hAnsi="Times New Roman" w:cs="Times New Roman"/>
+          <w:sz w:val="24"/>
+          <w:szCs w:val="24"/>
+        </w:rPr>
+      </w:pPr>
+      <w:r>
+        <w:rPr>
+          <w:rFonts w:ascii="Times New Roman" w:hAnsi="Times New Roman" w:cs="Times New Roman"/>
+          <w:sz w:val="24"/>
+          <w:szCs w:val="24"/>
+        </w:rPr>
+        <w:t>1. To study customer churn behavior in the telecom sector using customer data from the telecom industry.</w:t>
+      </w:r>
+    </w:p>
+    <w:p>
+      <w:pPr>
+        <w:spacing w:after="420" w:line="240" w:lineRule="auto"/>
+        <w:ind w:left="515" w:hanging="10"/>
+        <w:rPr>
+          <w:rFonts w:ascii="Times New Roman" w:hAnsi="Times New Roman" w:cs="Times New Roman"/>
+          <w:sz w:val="24"/>
+          <w:szCs w:val="24"/>
+        </w:rPr>
+      </w:pPr>
+      <w:r>
+        <w:rPr>
+          <w:rFonts w:ascii="Times New Roman" w:hAnsi="Times New Roman" w:cs="Times New Roman"/>
+          <w:sz w:val="24"/>
+          <w:szCs w:val="24"/>
+        </w:rPr>
+        <w:t>2. To understand how customer attributes affect churn in the telecom industry.</w:t>
+      </w:r>
+    </w:p>
+    <w:p>
+      <w:pPr>
+        <w:spacing w:after="420" w:line="240" w:lineRule="auto"/>
+        <w:ind w:left="515" w:hanging="10"/>
+        <w:rPr>
+          <w:rFonts w:ascii="Times New Roman" w:hAnsi="Times New Roman" w:cs="Times New Roman"/>
+          <w:sz w:val="24"/>
+          <w:szCs w:val="24"/>
+        </w:rPr>
+      </w:pPr>
+      <w:r>
+        <w:rPr>
+          <w:rFonts w:ascii="Times New Roman" w:hAnsi="Times New Roman" w:cs="Times New Roman"/>
+          <w:sz w:val="24"/>
+          <w:szCs w:val="24"/>
+        </w:rPr>
+        <w:t>3. To prepare data for analysis of customer churn.</w:t>
+      </w:r>
+    </w:p>
+    <w:p>
+      <w:pPr>
+        <w:spacing w:after="420" w:line="240" w:lineRule="auto"/>
+        <w:ind w:left="515" w:hanging="10"/>
+        <w:rPr>
+          <w:rFonts w:ascii="Times New Roman" w:hAnsi="Times New Roman" w:cs="Times New Roman"/>
+          <w:sz w:val="24"/>
+          <w:szCs w:val="24"/>
+        </w:rPr>
+      </w:pPr>
+      <w:r>
+        <w:rPr>
+          <w:rFonts w:ascii="Times New Roman" w:hAnsi="Times New Roman" w:cs="Times New Roman"/>
+          <w:sz w:val="24"/>
+          <w:szCs w:val="24"/>
+        </w:rPr>
+        <w:t>4. To find the factors that make customers leave the telecom services.</w:t>
+      </w:r>
+    </w:p>
+    <w:p>
+      <w:pPr>
+        <w:spacing w:after="420" w:line="240" w:lineRule="auto"/>
+        <w:ind w:left="515" w:hanging="10"/>
+        <w:rPr>
+          <w:rFonts w:ascii="Times New Roman" w:hAnsi="Times New Roman" w:cs="Times New Roman"/>
+          <w:sz w:val="24"/>
+          <w:szCs w:val="24"/>
+        </w:rPr>
+      </w:pPr>
+      <w:r>
+        <w:rPr>
+          <w:rFonts w:ascii="Times New Roman" w:hAnsi="Times New Roman" w:cs="Times New Roman"/>
+          <w:sz w:val="24"/>
+          <w:szCs w:val="24"/>
+        </w:rPr>
+        <w:t>5. To test if things like charges and contract type really affect churn in the telecom industry.</w:t>
+      </w:r>
+    </w:p>
+    <w:p>
+      <w:pPr>
+        <w:spacing w:after="420" w:line="240" w:lineRule="auto"/>
+        <w:ind w:left="515" w:hanging="10"/>
+        <w:rPr>
+          <w:rFonts w:ascii="Times New Roman" w:hAnsi="Times New Roman" w:cs="Times New Roman"/>
+          <w:sz w:val="24"/>
+          <w:szCs w:val="24"/>
+        </w:rPr>
+      </w:pPr>
+      <w:r>
+        <w:rPr>
+          <w:rFonts w:ascii="Times New Roman" w:hAnsi="Times New Roman" w:cs="Times New Roman"/>
+          <w:sz w:val="24"/>
+          <w:szCs w:val="24"/>
+        </w:rPr>
+        <w:t>6. To look at customer behavior using graphs and charts and statistics to understand customer churn.</w:t>
+      </w:r>
+    </w:p>
+    <w:p>
+      <w:pPr>
+        <w:spacing w:after="420" w:line="240" w:lineRule="auto"/>
+        <w:ind w:left="515" w:hanging="10"/>
+        <w:rPr>
+          <w:rFonts w:ascii="Times New Roman" w:hAnsi="Times New Roman" w:cs="Times New Roman"/>
+          <w:sz w:val="24"/>
+          <w:szCs w:val="24"/>
+        </w:rPr>
+      </w:pPr>
+      <w:r>
+        <w:rPr>
+          <w:rFonts w:ascii="Times New Roman" w:hAnsi="Times New Roman" w:cs="Times New Roman"/>
+          <w:sz w:val="24"/>
+          <w:szCs w:val="24"/>
+        </w:rPr>
+        <w:t>7. To use machine learning and analytics for churn analysis in the telecom industry.</w:t>
+      </w:r>
+    </w:p>
+    <w:p>
+      <w:pPr>
+        <w:spacing w:after="420" w:line="240" w:lineRule="auto"/>
+        <w:ind w:left="515" w:hanging="10"/>
+        <w:rPr>
+          <w:rFonts w:ascii="Times New Roman" w:hAnsi="Times New Roman" w:cs="Times New Roman"/>
+          <w:sz w:val="24"/>
+          <w:szCs w:val="24"/>
+        </w:rPr>
+      </w:pPr>
+      <w:r>
+        <w:rPr>
+          <w:rFonts w:ascii="Times New Roman" w:hAnsi="Times New Roman" w:cs="Times New Roman"/>
+          <w:sz w:val="24"/>
+          <w:szCs w:val="24"/>
+        </w:rPr>
+        <w:t>8. To give ideas to improve customer retention in the telecom industry.</w:t>
+      </w:r>
+    </w:p>
+    <w:p>
+      <w:pPr>
+        <w:spacing w:after="420" w:line="240" w:lineRule="auto"/>
+        <w:ind w:left="515" w:hanging="10"/>
+        <w:rPr>
+          <w:rFonts w:ascii="Times New Roman" w:hAnsi="Times New Roman" w:cs="Times New Roman"/>
+          <w:sz w:val="24"/>
+          <w:szCs w:val="24"/>
+        </w:rPr>
+      </w:pPr>
+      <w:r>
+        <w:rPr>
+          <w:rFonts w:ascii="Times New Roman" w:hAnsi="Times New Roman" w:cs="Times New Roman"/>
+          <w:sz w:val="24"/>
+          <w:szCs w:val="24"/>
+        </w:rPr>
+        <w:lastRenderedPageBreak/>
+        <w:t>9. To help telecom companies make decisions using data from the telecom industry.</w:t>
+      </w:r>
+    </w:p>
+    <w:p>
+      <w:pPr>
+        <w:spacing w:after="420" w:line="240" w:lineRule="auto"/>
+        <w:ind w:left="515" w:hanging="10"/>
+        <w:rPr>
+          <w:rFonts w:ascii="Times New Roman" w:hAnsi="Times New Roman" w:cs="Times New Roman"/>
+          <w:sz w:val="24"/>
+          <w:szCs w:val="24"/>
+        </w:rPr>
+      </w:pPr>
+      <w:r>
+        <w:rPr>
+          <w:rFonts w:ascii="Times New Roman" w:hAnsi="Times New Roman" w:cs="Times New Roman"/>
+          <w:sz w:val="24"/>
+          <w:szCs w:val="24"/>
+        </w:rPr>
+        <w:t>10. To improve our knowledge of business analytics and data analysis and machine learning in the telecom industry.</w:t>
+      </w:r>
+    </w:p>
+    <w:p>
+      <w:pPr>
+        <w:spacing w:after="420" w:line="240" w:lineRule="auto"/>
+        <w:ind w:left="515" w:hanging="10"/>
+        <w:jc w:val="center"/>
+        <w:rPr>
+          <w:rFonts w:ascii="Times New Roman" w:hAnsi="Times New Roman" w:cs="Times New Roman"/>
+          <w:sz w:val="24"/>
+          <w:szCs w:val="24"/>
+        </w:rPr>
+      </w:pPr>
+      <w:r>
+        <w:rPr>
+          <w:rFonts w:ascii="Times New Roman" w:hAnsi="Times New Roman" w:cs="Times New Roman"/>
+          <w:sz w:val="24"/>
+          <w:szCs w:val="24"/>
+        </w:rPr>
+        <w:t>---</w:t>
+      </w:r>
+    </w:p>
+    <w:p>
+      <w:pPr>
+        <w:spacing w:after="420" w:line="240" w:lineRule="auto"/>
+        <w:ind w:left="515" w:hanging="10"/>
+        <w:jc w:val="center"/>
+        <w:rPr>
+          <w:rFonts w:ascii="Times New Roman" w:hAnsi="Times New Roman" w:cs="Times New Roman"/>
+          <w:b/>
+          <w:bCs/>
+          <w:sz w:val="24"/>
+          <w:szCs w:val="24"/>
+        </w:rPr>
+      </w:pPr>
+      <w:r>
+        <w:rPr>
+          <w:rFonts w:ascii="Times New Roman" w:hAnsi="Times New Roman" w:cs="Times New Roman"/>
+          <w:b/>
+          <w:bCs/>
+          <w:sz w:val="24"/>
+          <w:szCs w:val="24"/>
+        </w:rPr>
+        <w:t>2.3 Scope of the Study</w:t>
+      </w:r>
+    </w:p>
+    <w:p>
+      <w:pPr>
+        <w:spacing w:after="420" w:line="240" w:lineRule="auto"/>
+        <w:ind w:left="515" w:hanging="10"/>
+        <w:rPr>
+          <w:rFonts w:ascii="Times New Roman" w:hAnsi="Times New Roman" w:cs="Times New Roman"/>
+          <w:sz w:val="24"/>
+          <w:szCs w:val="24"/>
+        </w:rPr>
+      </w:pPr>
+      <w:r>
+        <w:rPr>
+          <w:rFonts w:ascii="Times New Roman" w:hAnsi="Times New Roman" w:cs="Times New Roman"/>
+          <w:sz w:val="24"/>
+          <w:szCs w:val="24"/>
+        </w:rPr>
+        <w:t>This project only looks at customer churn analysis in the telecom industry. We use a telecom customer dataset to understand customer behavior. Find factors that influence customer churn in the telecom industry.</w:t>
+      </w:r>
+    </w:p>
+    <w:p>
+      <w:pPr>
+        <w:spacing w:after="420" w:line="240" w:lineRule="auto"/>
+        <w:ind w:left="515" w:hanging="10"/>
+        <w:rPr>
+          <w:rFonts w:ascii="Times New Roman" w:hAnsi="Times New Roman" w:cs="Times New Roman"/>
+          <w:sz w:val="24"/>
+          <w:szCs w:val="24"/>
+        </w:rPr>
+      </w:pPr>
+      <w:r>
+        <w:rPr>
+          <w:rFonts w:ascii="Times New Roman" w:hAnsi="Times New Roman" w:cs="Times New Roman"/>
+          <w:sz w:val="24"/>
+          <w:szCs w:val="24"/>
+        </w:rPr>
+        <w:t>We look at things like</w:t>
+      </w:r>
+    </w:p>
+    <w:p>
+      <w:pPr>
+        <w:spacing w:after="420" w:line="240" w:lineRule="auto"/>
+        <w:ind w:left="515" w:hanging="10"/>
+        <w:rPr>
+          <w:rFonts w:ascii="Times New Roman" w:hAnsi="Times New Roman" w:cs="Times New Roman"/>
+          <w:sz w:val="24"/>
+          <w:szCs w:val="24"/>
+        </w:rPr>
+      </w:pPr>
+      <w:r>
+        <w:rPr>
+          <w:rFonts w:ascii="Times New Roman" w:hAnsi="Times New Roman" w:cs="Times New Roman"/>
+          <w:sz w:val="24"/>
+          <w:szCs w:val="24"/>
+        </w:rPr>
+        <w:t>● Gender</w:t>
+      </w:r>
+    </w:p>
+    <w:p>
+      <w:pPr>
+        <w:spacing w:after="420" w:line="240" w:lineRule="auto"/>
+        <w:ind w:left="515" w:hanging="10"/>
+        <w:rPr>
+          <w:rFonts w:ascii="Times New Roman" w:hAnsi="Times New Roman" w:cs="Times New Roman"/>
+          <w:sz w:val="24"/>
+          <w:szCs w:val="24"/>
+        </w:rPr>
+      </w:pPr>
+      <w:r>
+        <w:rPr>
+          <w:rFonts w:ascii="Times New Roman" w:hAnsi="Times New Roman" w:cs="Times New Roman"/>
+          <w:sz w:val="24"/>
+          <w:szCs w:val="24"/>
+        </w:rPr>
+        <w:t>● Senior Citizen</w:t>
+      </w:r>
+    </w:p>
+    <w:p>
+      <w:pPr>
+        <w:spacing w:after="420" w:line="240" w:lineRule="auto"/>
+        <w:ind w:left="515" w:hanging="10"/>
+        <w:rPr>
+          <w:rFonts w:ascii="Times New Roman" w:hAnsi="Times New Roman" w:cs="Times New Roman"/>
+          <w:sz w:val="24"/>
+          <w:szCs w:val="24"/>
+        </w:rPr>
+      </w:pPr>
+      <w:r>
+        <w:rPr>
+          <w:rFonts w:ascii="Times New Roman" w:hAnsi="Times New Roman" w:cs="Times New Roman"/>
+          <w:sz w:val="24"/>
+          <w:szCs w:val="24"/>
+        </w:rPr>
+        <w:t>● Tenure</w:t>
+      </w:r>
+    </w:p>
+    <w:p>
+      <w:pPr>
+        <w:spacing w:after="420" w:line="240" w:lineRule="auto"/>
+        <w:ind w:left="515" w:hanging="10"/>
+        <w:rPr>
+          <w:rFonts w:ascii="Times New Roman" w:hAnsi="Times New Roman" w:cs="Times New Roman"/>
+          <w:sz w:val="24"/>
+          <w:szCs w:val="24"/>
+        </w:rPr>
+      </w:pPr>
+      <w:r>
+        <w:rPr>
+          <w:rFonts w:ascii="Times New Roman" w:hAnsi="Times New Roman" w:cs="Times New Roman"/>
+          <w:sz w:val="24"/>
+          <w:szCs w:val="24"/>
+        </w:rPr>
+        <w:t>● Monthly Charges</w:t>
+      </w:r>
+    </w:p>
+    <w:p>
+      <w:pPr>
+        <w:spacing w:after="420" w:line="240" w:lineRule="auto"/>
+        <w:ind w:left="515" w:hanging="10"/>
+        <w:rPr>
+          <w:rFonts w:ascii="Times New Roman" w:hAnsi="Times New Roman" w:cs="Times New Roman"/>
+          <w:sz w:val="24"/>
+          <w:szCs w:val="24"/>
+        </w:rPr>
+      </w:pPr>
+      <w:r>
+        <w:rPr>
+          <w:rFonts w:ascii="Times New Roman" w:hAnsi="Times New Roman" w:cs="Times New Roman"/>
+          <w:sz w:val="24"/>
+          <w:szCs w:val="24"/>
+        </w:rPr>
+        <w:t>● Charges</w:t>
+      </w:r>
+    </w:p>
+    <w:p>
+      <w:pPr>
+        <w:spacing w:after="420" w:line="240" w:lineRule="auto"/>
+        <w:ind w:left="515" w:hanging="10"/>
+        <w:rPr>
+          <w:rFonts w:ascii="Times New Roman" w:hAnsi="Times New Roman" w:cs="Times New Roman"/>
+          <w:sz w:val="24"/>
+          <w:szCs w:val="24"/>
+        </w:rPr>
+      </w:pPr>
+      <w:r>
+        <w:rPr>
+          <w:rFonts w:ascii="Times New Roman" w:hAnsi="Times New Roman" w:cs="Times New Roman"/>
+          <w:sz w:val="24"/>
+          <w:szCs w:val="24"/>
+        </w:rPr>
+        <w:t>● Internet Service</w:t>
+      </w:r>
+    </w:p>
+    <w:p>
+      <w:pPr>
+        <w:spacing w:after="420" w:line="240" w:lineRule="auto"/>
+        <w:ind w:left="515" w:hanging="10"/>
+        <w:rPr>
+          <w:rFonts w:ascii="Times New Roman" w:hAnsi="Times New Roman" w:cs="Times New Roman"/>
+          <w:sz w:val="24"/>
+          <w:szCs w:val="24"/>
+        </w:rPr>
+      </w:pPr>
+      <w:r>
+        <w:rPr>
+          <w:rFonts w:ascii="Times New Roman" w:hAnsi="Times New Roman" w:cs="Times New Roman"/>
+          <w:sz w:val="24"/>
+          <w:szCs w:val="24"/>
+        </w:rPr>
+        <w:t>● Contract Type</w:t>
+      </w:r>
+    </w:p>
+    <w:p>
+      <w:pPr>
+        <w:spacing w:after="420" w:line="240" w:lineRule="auto"/>
+        <w:ind w:left="515" w:hanging="10"/>
+        <w:rPr>
+          <w:rFonts w:ascii="Times New Roman" w:hAnsi="Times New Roman" w:cs="Times New Roman"/>
+          <w:sz w:val="24"/>
+          <w:szCs w:val="24"/>
+        </w:rPr>
+      </w:pPr>
+      <w:r>
+        <w:rPr>
+          <w:rFonts w:ascii="Times New Roman" w:hAnsi="Times New Roman" w:cs="Times New Roman"/>
+          <w:sz w:val="24"/>
+          <w:szCs w:val="24"/>
+        </w:rPr>
+        <w:t>● Payment Method</w:t>
+      </w:r>
+    </w:p>
+    <w:p>
+      <w:pPr>
+        <w:spacing w:after="420" w:line="240" w:lineRule="auto"/>
+        <w:ind w:left="515" w:hanging="10"/>
+        <w:rPr>
+          <w:rFonts w:ascii="Times New Roman" w:hAnsi="Times New Roman" w:cs="Times New Roman"/>
+          <w:sz w:val="24"/>
+          <w:szCs w:val="24"/>
+        </w:rPr>
+      </w:pPr>
+      <w:r>
+        <w:rPr>
+          <w:rFonts w:ascii="Times New Roman" w:hAnsi="Times New Roman" w:cs="Times New Roman"/>
+          <w:sz w:val="24"/>
+          <w:szCs w:val="24"/>
+        </w:rPr>
+        <w:t>● Churn Status</w:t>
+      </w:r>
+    </w:p>
+    <w:p>
+      <w:pPr>
+        <w:spacing w:after="420" w:line="240" w:lineRule="auto"/>
+        <w:ind w:left="515" w:hanging="10"/>
+        <w:rPr>
+          <w:rFonts w:ascii="Times New Roman" w:hAnsi="Times New Roman" w:cs="Times New Roman"/>
+          <w:sz w:val="24"/>
+          <w:szCs w:val="24"/>
+        </w:rPr>
+      </w:pPr>
+      <w:r>
+        <w:rPr>
+          <w:rFonts w:ascii="Times New Roman" w:hAnsi="Times New Roman" w:cs="Times New Roman"/>
+          <w:sz w:val="24"/>
+          <w:szCs w:val="24"/>
+        </w:rPr>
+        <w:t>in the telecom industry.</w:t>
+      </w:r>
+    </w:p>
+    <w:p>
+      <w:pPr>
+        <w:spacing w:after="420" w:line="240" w:lineRule="auto"/>
+        <w:ind w:left="515" w:hanging="10"/>
+        <w:rPr>
+          <w:rFonts w:ascii="Times New Roman" w:hAnsi="Times New Roman" w:cs="Times New Roman"/>
+          <w:sz w:val="24"/>
+          <w:szCs w:val="24"/>
+        </w:rPr>
+      </w:pPr>
+      <w:r>
+        <w:rPr>
+          <w:rFonts w:ascii="Times New Roman" w:hAnsi="Times New Roman" w:cs="Times New Roman"/>
+          <w:sz w:val="24"/>
+          <w:szCs w:val="24"/>
+        </w:rPr>
+        <w:t>We do not focus on a telecom company or region. We use data from a telecom churn dataset from the telecom industry.</w:t>
+      </w:r>
+    </w:p>
+    <w:p>
+      <w:pPr>
+        <w:spacing w:after="420" w:line="240" w:lineRule="auto"/>
+        <w:ind w:left="515" w:hanging="10"/>
+        <w:rPr>
+          <w:rFonts w:ascii="Times New Roman" w:hAnsi="Times New Roman" w:cs="Times New Roman"/>
+          <w:sz w:val="24"/>
+          <w:szCs w:val="24"/>
+        </w:rPr>
+      </w:pPr>
+      <w:r>
+        <w:rPr>
+          <w:rFonts w:ascii="Times New Roman" w:hAnsi="Times New Roman" w:cs="Times New Roman"/>
+          <w:sz w:val="24"/>
+          <w:szCs w:val="24"/>
+        </w:rPr>
+        <w:t>Our analysis includes</w:t>
+      </w:r>
+    </w:p>
+    <w:p>
+      <w:pPr>
+        <w:spacing w:after="420" w:line="240" w:lineRule="auto"/>
+        <w:ind w:left="515" w:hanging="10"/>
+        <w:rPr>
+          <w:rFonts w:ascii="Times New Roman" w:hAnsi="Times New Roman" w:cs="Times New Roman"/>
+          <w:sz w:val="24"/>
+          <w:szCs w:val="24"/>
+        </w:rPr>
+      </w:pPr>
+      <w:r>
+        <w:rPr>
+          <w:rFonts w:ascii="Times New Roman" w:hAnsi="Times New Roman" w:cs="Times New Roman"/>
+          <w:sz w:val="24"/>
+          <w:szCs w:val="24"/>
+        </w:rPr>
+        <w:t>● Data preparation</w:t>
+      </w:r>
+    </w:p>
+    <w:p>
+      <w:pPr>
+        <w:spacing w:after="420" w:line="240" w:lineRule="auto"/>
+        <w:ind w:left="515" w:hanging="10"/>
+        <w:rPr>
+          <w:rFonts w:ascii="Times New Roman" w:hAnsi="Times New Roman" w:cs="Times New Roman"/>
+          <w:sz w:val="24"/>
+          <w:szCs w:val="24"/>
+        </w:rPr>
+      </w:pPr>
+      <w:r>
+        <w:rPr>
+          <w:rFonts w:ascii="Times New Roman" w:hAnsi="Times New Roman" w:cs="Times New Roman"/>
+          <w:sz w:val="24"/>
+          <w:szCs w:val="24"/>
+        </w:rPr>
+        <w:t>● Exploratory Data Analysis</w:t>
+      </w:r>
+    </w:p>
+    <w:p>
+      <w:pPr>
+        <w:spacing w:after="420" w:line="240" w:lineRule="auto"/>
+        <w:ind w:left="515" w:hanging="10"/>
+        <w:rPr>
+          <w:rFonts w:ascii="Times New Roman" w:hAnsi="Times New Roman" w:cs="Times New Roman"/>
+          <w:sz w:val="24"/>
+          <w:szCs w:val="24"/>
+        </w:rPr>
+      </w:pPr>
+      <w:r>
+        <w:rPr>
+          <w:rFonts w:ascii="Times New Roman" w:hAnsi="Times New Roman" w:cs="Times New Roman"/>
+          <w:sz w:val="24"/>
+          <w:szCs w:val="24"/>
+        </w:rPr>
+        <w:lastRenderedPageBreak/>
+        <w:t>● Data visualization</w:t>
+      </w:r>
+    </w:p>
+    <w:p>
+      <w:pPr>
+        <w:spacing w:after="420" w:line="240" w:lineRule="auto"/>
+        <w:ind w:left="515" w:hanging="10"/>
+        <w:rPr>
+          <w:rFonts w:ascii="Times New Roman" w:hAnsi="Times New Roman" w:cs="Times New Roman"/>
+          <w:sz w:val="24"/>
+          <w:szCs w:val="24"/>
+        </w:rPr>
+      </w:pPr>
+      <w:r>
+        <w:rPr>
+          <w:rFonts w:ascii="Times New Roman" w:hAnsi="Times New Roman" w:cs="Times New Roman"/>
+          <w:sz w:val="24"/>
+          <w:szCs w:val="24"/>
+        </w:rPr>
+        <w:t>● Correlation analysis</w:t>
+      </w:r>
+    </w:p>
+    <w:p>
+      <w:pPr>
+        <w:spacing w:after="420" w:line="240" w:lineRule="auto"/>
+        <w:ind w:left="515" w:hanging="10"/>
+        <w:rPr>
+          <w:rFonts w:ascii="Times New Roman" w:hAnsi="Times New Roman" w:cs="Times New Roman"/>
+          <w:sz w:val="24"/>
+          <w:szCs w:val="24"/>
+        </w:rPr>
+      </w:pPr>
+      <w:r>
+        <w:rPr>
+          <w:rFonts w:ascii="Times New Roman" w:hAnsi="Times New Roman" w:cs="Times New Roman"/>
+          <w:sz w:val="24"/>
+          <w:szCs w:val="24"/>
+        </w:rPr>
+        <w:t>● Hypothesis testing</w:t>
+      </w:r>
+    </w:p>
+    <w:p>
+      <w:pPr>
+        <w:spacing w:after="420" w:line="240" w:lineRule="auto"/>
+        <w:ind w:left="515" w:hanging="10"/>
+        <w:rPr>
+          <w:rFonts w:ascii="Times New Roman" w:hAnsi="Times New Roman" w:cs="Times New Roman"/>
+          <w:sz w:val="24"/>
+          <w:szCs w:val="24"/>
+        </w:rPr>
+      </w:pPr>
+      <w:r>
+        <w:rPr>
+          <w:rFonts w:ascii="Times New Roman" w:hAnsi="Times New Roman" w:cs="Times New Roman"/>
+          <w:sz w:val="24"/>
+          <w:szCs w:val="24"/>
+        </w:rPr>
+        <w:t>● Customer behavior analysis</w:t>
+      </w:r>
+    </w:p>
+    <w:p>
+      <w:pPr>
+        <w:spacing w:after="420" w:line="240" w:lineRule="auto"/>
+        <w:ind w:left="515" w:hanging="10"/>
+        <w:rPr>
+          <w:rFonts w:ascii="Times New Roman" w:hAnsi="Times New Roman" w:cs="Times New Roman"/>
+          <w:sz w:val="24"/>
+          <w:szCs w:val="24"/>
+        </w:rPr>
+      </w:pPr>
+      <w:r>
+        <w:rPr>
+          <w:rFonts w:ascii="Times New Roman" w:hAnsi="Times New Roman" w:cs="Times New Roman"/>
+          <w:sz w:val="24"/>
+          <w:szCs w:val="24"/>
+        </w:rPr>
+        <w:t>● Business interpretation of findings</w:t>
+      </w:r>
+    </w:p>
+    <w:p>
+      <w:pPr>
+        <w:spacing w:after="420" w:line="240" w:lineRule="auto"/>
+        <w:ind w:left="515" w:hanging="10"/>
+        <w:rPr>
+          <w:rFonts w:ascii="Times New Roman" w:hAnsi="Times New Roman" w:cs="Times New Roman"/>
+          <w:sz w:val="24"/>
+          <w:szCs w:val="24"/>
+        </w:rPr>
+      </w:pPr>
+      <w:r>
+        <w:rPr>
+          <w:rFonts w:ascii="Times New Roman" w:hAnsi="Times New Roman" w:cs="Times New Roman"/>
+          <w:sz w:val="24"/>
+          <w:szCs w:val="24"/>
+        </w:rPr>
+        <w:t>in the telecom industry.</w:t>
+      </w:r>
+    </w:p>
+    <w:p>
+      <w:pPr>
+        <w:spacing w:after="420" w:line="240" w:lineRule="auto"/>
+        <w:ind w:left="515" w:hanging="10"/>
+        <w:rPr>
+          <w:rFonts w:ascii="Times New Roman" w:hAnsi="Times New Roman" w:cs="Times New Roman"/>
+          <w:sz w:val="24"/>
+          <w:szCs w:val="24"/>
+        </w:rPr>
+      </w:pPr>
+      <w:r>
+        <w:rPr>
+          <w:rFonts w:ascii="Times New Roman" w:hAnsi="Times New Roman" w:cs="Times New Roman"/>
+          <w:sz w:val="24"/>
+          <w:szCs w:val="24"/>
+        </w:rPr>
+        <w:t>This project is for purposes, part of an MBA specialization in Business Analytics.</w:t>
+      </w:r>
+    </w:p>
+    <w:p>
+      <w:pPr>
+        <w:spacing w:after="420" w:line="240" w:lineRule="auto"/>
+        <w:ind w:left="515" w:hanging="10"/>
+        <w:jc w:val="center"/>
+        <w:rPr>
+          <w:rFonts w:ascii="Times New Roman" w:hAnsi="Times New Roman" w:cs="Times New Roman"/>
+          <w:sz w:val="24"/>
+          <w:szCs w:val="24"/>
+        </w:rPr>
+      </w:pPr>
+      <w:r>
+        <w:rPr>
+          <w:rFonts w:ascii="Times New Roman" w:hAnsi="Times New Roman" w:cs="Times New Roman"/>
+          <w:sz w:val="24"/>
+          <w:szCs w:val="24"/>
+        </w:rPr>
+        <w:t>---</w:t>
+      </w:r>
+    </w:p>
+    <w:p>
+      <w:pPr>
+        <w:spacing w:after="420" w:line="240" w:lineRule="auto"/>
+        <w:ind w:left="515" w:hanging="10"/>
+        <w:jc w:val="center"/>
+        <w:rPr>
+          <w:rFonts w:ascii="Times New Roman" w:hAnsi="Times New Roman" w:cs="Times New Roman"/>
+          <w:b/>
+          <w:bCs/>
+          <w:sz w:val="24"/>
+          <w:szCs w:val="24"/>
+        </w:rPr>
+      </w:pPr>
+      <w:r>
+        <w:rPr>
+          <w:rFonts w:ascii="Times New Roman" w:hAnsi="Times New Roman" w:cs="Times New Roman"/>
+          <w:b/>
+          <w:bCs/>
+          <w:sz w:val="24"/>
+          <w:szCs w:val="24"/>
+        </w:rPr>
+        <w:t>2.4 Importance and Need for the Study</w:t>
+      </w:r>
+    </w:p>
+    <w:p>
+      <w:pPr>
+        <w:spacing w:after="420" w:line="240" w:lineRule="auto"/>
+        <w:ind w:left="515" w:hanging="10"/>
+        <w:rPr>
+          <w:rFonts w:ascii="Times New Roman" w:hAnsi="Times New Roman" w:cs="Times New Roman"/>
+          <w:sz w:val="24"/>
+          <w:szCs w:val="24"/>
+        </w:rPr>
+      </w:pPr>
+      <w:r>
+        <w:rPr>
+          <w:rFonts w:ascii="Times New Roman" w:hAnsi="Times New Roman" w:cs="Times New Roman"/>
+          <w:sz w:val="24"/>
+          <w:szCs w:val="24"/>
+        </w:rPr>
+        <w:t>Customer churn in the telecom industry is a problem. Companies lose money when customers switch to competitors in the telecom industry.</w:t>
+      </w:r>
+    </w:p>
+    <w:p>
+      <w:pPr>
+        <w:spacing w:after="420" w:line="240" w:lineRule="auto"/>
+        <w:ind w:left="515" w:hanging="10"/>
+        <w:rPr>
+          <w:rFonts w:ascii="Times New Roman" w:hAnsi="Times New Roman" w:cs="Times New Roman"/>
+          <w:sz w:val="24"/>
+          <w:szCs w:val="24"/>
+        </w:rPr>
+      </w:pPr>
+      <w:r>
+        <w:rPr>
+          <w:rFonts w:ascii="Times New Roman" w:hAnsi="Times New Roman" w:cs="Times New Roman"/>
+          <w:sz w:val="24"/>
+          <w:szCs w:val="24"/>
+        </w:rPr>
+        <w:t>It is important for telecom companies to understand customer behavior and why customers leave the telecom services.</w:t>
+      </w:r>
+    </w:p>
+    <w:p>
+      <w:pPr>
+        <w:spacing w:after="420" w:line="240" w:lineRule="auto"/>
+        <w:ind w:left="515" w:hanging="10"/>
+        <w:rPr>
+          <w:rFonts w:ascii="Times New Roman" w:hAnsi="Times New Roman" w:cs="Times New Roman"/>
+          <w:sz w:val="24"/>
+          <w:szCs w:val="24"/>
+        </w:rPr>
+      </w:pPr>
+      <w:r>
+        <w:rPr>
+          <w:rFonts w:ascii="Times New Roman" w:hAnsi="Times New Roman" w:cs="Times New Roman"/>
+          <w:sz w:val="24"/>
+          <w:szCs w:val="24"/>
+        </w:rPr>
+        <w:t>This study is important because it helps companies understand customer behavior and identify high-risk customers and improve customer retention and reduce customer loss and improve service quality and increase customer satisfaction and make decisions using data from the telecom industry.</w:t>
+      </w:r>
+    </w:p>
+    <w:p>
+      <w:pPr>
+        <w:spacing w:after="420" w:line="240" w:lineRule="auto"/>
+        <w:ind w:left="515" w:hanging="10"/>
+        <w:rPr>
+          <w:rFonts w:ascii="Times New Roman" w:hAnsi="Times New Roman" w:cs="Times New Roman"/>
+          <w:sz w:val="24"/>
+          <w:szCs w:val="24"/>
+        </w:rPr>
+      </w:pPr>
+      <w:r>
+        <w:rPr>
+          <w:rFonts w:ascii="Times New Roman" w:hAnsi="Times New Roman" w:cs="Times New Roman"/>
+          <w:sz w:val="24"/>
+          <w:szCs w:val="24"/>
+        </w:rPr>
+        <w:t>The study also shows how data analytics and machine learning can solve business problems in the telecom industry.</w:t>
+      </w:r>
+    </w:p>
+    <w:p>
+      <w:pPr>
+        <w:spacing w:after="420" w:line="240" w:lineRule="auto"/>
+        <w:ind w:left="515" w:hanging="10"/>
+        <w:rPr>
+          <w:rFonts w:ascii="Times New Roman" w:hAnsi="Times New Roman" w:cs="Times New Roman"/>
+          <w:sz w:val="24"/>
+          <w:szCs w:val="24"/>
+        </w:rPr>
+      </w:pPr>
+      <w:r>
+        <w:rPr>
+          <w:rFonts w:ascii="Times New Roman" w:hAnsi="Times New Roman" w:cs="Times New Roman"/>
+          <w:sz w:val="24"/>
+          <w:szCs w:val="24"/>
+        </w:rPr>
+        <w:t>Telecom companies generate a lot of customer data from the telecom industry. It is not always analyzed properly.</w:t>
+      </w:r>
+    </w:p>
+    <w:p>
+      <w:pPr>
+        <w:spacing w:after="420" w:line="240" w:lineRule="auto"/>
+        <w:ind w:left="515" w:hanging="10"/>
+        <w:rPr>
+          <w:rFonts w:ascii="Times New Roman" w:hAnsi="Times New Roman" w:cs="Times New Roman"/>
+          <w:sz w:val="24"/>
+          <w:szCs w:val="24"/>
+        </w:rPr>
+      </w:pPr>
+      <w:r>
+        <w:rPr>
+          <w:rFonts w:ascii="Times New Roman" w:hAnsi="Times New Roman" w:cs="Times New Roman"/>
+          <w:sz w:val="24"/>
+          <w:szCs w:val="24"/>
+        </w:rPr>
+        <w:t>By using analytics companies can turn data into insights to improve the telecom industry.</w:t>
+      </w:r>
+    </w:p>
+    <w:p>
+      <w:pPr>
+        <w:spacing w:after="420" w:line="240" w:lineRule="auto"/>
+        <w:ind w:left="515" w:hanging="10"/>
+        <w:rPr>
+          <w:rFonts w:ascii="Times New Roman" w:hAnsi="Times New Roman" w:cs="Times New Roman"/>
+          <w:sz w:val="24"/>
+          <w:szCs w:val="24"/>
+        </w:rPr>
+      </w:pPr>
+      <w:r>
+        <w:rPr>
+          <w:rFonts w:ascii="Times New Roman" w:hAnsi="Times New Roman" w:cs="Times New Roman"/>
+          <w:sz w:val="24"/>
+          <w:szCs w:val="24"/>
+        </w:rPr>
+        <w:t>This project also helps students understand how business analytics and machine learning and statistics are used in the business world of the telecom industry.</w:t>
+      </w:r>
+    </w:p>
+    <w:p>
+      <w:pPr>
+        <w:spacing w:after="420" w:line="240" w:lineRule="auto"/>
+        <w:ind w:left="515" w:hanging="10"/>
+        <w:jc w:val="center"/>
+        <w:rPr>
+          <w:rFonts w:ascii="Times New Roman" w:hAnsi="Times New Roman" w:cs="Times New Roman"/>
+          <w:sz w:val="24"/>
+          <w:szCs w:val="24"/>
+        </w:rPr>
+      </w:pPr>
+      <w:r>
+        <w:rPr>
+          <w:rFonts w:ascii="Times New Roman" w:hAnsi="Times New Roman" w:cs="Times New Roman"/>
+          <w:sz w:val="24"/>
+          <w:szCs w:val="24"/>
+        </w:rPr>
+        <w:t>---</w:t>
+      </w:r>
+    </w:p>
+    <w:p>
+      <w:pPr>
+        <w:spacing w:after="420" w:line="240" w:lineRule="auto"/>
+        <w:ind w:left="515" w:hanging="10"/>
+        <w:jc w:val="center"/>
+        <w:rPr>
+          <w:rFonts w:ascii="Times New Roman" w:hAnsi="Times New Roman" w:cs="Times New Roman"/>
+          <w:b/>
+          <w:bCs/>
+          <w:sz w:val="24"/>
+          <w:szCs w:val="24"/>
+        </w:rPr>
+      </w:pPr>
+      <w:r>
+        <w:rPr>
+          <w:rFonts w:ascii="Times New Roman" w:hAnsi="Times New Roman" w:cs="Times New Roman"/>
+          <w:b/>
+          <w:bCs/>
+          <w:sz w:val="24"/>
+          <w:szCs w:val="24"/>
+        </w:rPr>
+        <w:t>2</w:t>
+      </w:r>
+      <w:r>
+        <w:rPr>
+          <w:rFonts w:ascii="Times New Roman" w:hAnsi="Times New Roman" w:cs="Times New Roman"/>
+          <w:b/>
+          <w:bCs/>
+          <w:sz w:val="24"/>
+          <w:szCs w:val="24"/>
+        </w:rPr>
+        <w:t>.5 Variables Used in the Study</w:t>
+      </w:r>
+    </w:p>
+    <w:p>
+      <w:pPr>
+        <w:spacing w:after="420" w:line="240" w:lineRule="auto"/>
+        <w:ind w:left="515" w:hanging="10"/>
+        <w:rPr>
+          <w:rFonts w:ascii="Times New Roman" w:hAnsi="Times New Roman" w:cs="Times New Roman"/>
+          <w:sz w:val="24"/>
+          <w:szCs w:val="24"/>
+        </w:rPr>
+      </w:pPr>
+      <w:r>
+        <w:rPr>
+          <w:rFonts w:ascii="Times New Roman" w:hAnsi="Times New Roman" w:cs="Times New Roman"/>
+          <w:sz w:val="24"/>
+          <w:szCs w:val="24"/>
+        </w:rPr>
+        <w:lastRenderedPageBreak/>
+        <w:t>We use variables from the telecom customer churn dataset to analyze customer behavior in the telecom industry.</w:t>
+      </w:r>
+    </w:p>
+    <w:p>
+      <w:pPr>
+        <w:spacing w:after="420" w:line="240" w:lineRule="auto"/>
+        <w:ind w:left="515" w:hanging="10"/>
+        <w:rPr>
+          <w:rFonts w:ascii="Times New Roman" w:hAnsi="Times New Roman" w:cs="Times New Roman"/>
+          <w:sz w:val="24"/>
+          <w:szCs w:val="24"/>
+        </w:rPr>
+      </w:pPr>
+      <w:r>
+        <w:rPr>
+          <w:rFonts w:ascii="Times New Roman" w:hAnsi="Times New Roman" w:cs="Times New Roman"/>
+          <w:sz w:val="24"/>
+          <w:szCs w:val="24"/>
+        </w:rPr>
+        <w:t>Some important variables we use are</w:t>
+      </w:r>
+    </w:p>
+    <w:p>
+      <w:pPr>
+        <w:spacing w:after="420" w:line="240" w:lineRule="auto"/>
+        <w:ind w:left="515" w:hanging="10"/>
+        <w:rPr>
+          <w:rFonts w:ascii="Times New Roman" w:hAnsi="Times New Roman" w:cs="Times New Roman"/>
+          <w:sz w:val="24"/>
+          <w:szCs w:val="24"/>
+        </w:rPr>
+      </w:pPr>
+      <w:r>
+        <w:rPr>
+          <w:rFonts w:ascii="Times New Roman" w:hAnsi="Times New Roman" w:cs="Times New Roman"/>
+          <w:sz w:val="24"/>
+          <w:szCs w:val="24"/>
+        </w:rPr>
+        <w:t>● Tenure</w:t>
+      </w:r>
+    </w:p>
+    <w:p>
+      <w:pPr>
+        <w:spacing w:after="420" w:line="240" w:lineRule="auto"/>
+        <w:ind w:left="515" w:hanging="10"/>
+        <w:rPr>
+          <w:rFonts w:ascii="Times New Roman" w:hAnsi="Times New Roman" w:cs="Times New Roman"/>
+          <w:sz w:val="24"/>
+          <w:szCs w:val="24"/>
+        </w:rPr>
+      </w:pPr>
+      <w:r>
+        <w:rPr>
+          <w:rFonts w:ascii="Times New Roman" w:hAnsi="Times New Roman" w:cs="Times New Roman"/>
+          <w:sz w:val="24"/>
+          <w:szCs w:val="24"/>
+        </w:rPr>
+        <w:t>● Monthly Charges</w:t>
+      </w:r>
+    </w:p>
+    <w:p>
+      <w:pPr>
+        <w:spacing w:after="420" w:line="240" w:lineRule="auto"/>
+        <w:ind w:left="515" w:hanging="10"/>
+        <w:rPr>
+          <w:rFonts w:ascii="Times New Roman" w:hAnsi="Times New Roman" w:cs="Times New Roman"/>
+          <w:sz w:val="24"/>
+          <w:szCs w:val="24"/>
+        </w:rPr>
+      </w:pPr>
+      <w:r>
+        <w:rPr>
+          <w:rFonts w:ascii="Times New Roman" w:hAnsi="Times New Roman" w:cs="Times New Roman"/>
+          <w:sz w:val="24"/>
+          <w:szCs w:val="24"/>
+        </w:rPr>
+        <w:t>● Charges</w:t>
+      </w:r>
+    </w:p>
+    <w:p>
+      <w:pPr>
+        <w:spacing w:after="420" w:line="240" w:lineRule="auto"/>
+        <w:ind w:left="515" w:hanging="10"/>
+        <w:rPr>
+          <w:rFonts w:ascii="Times New Roman" w:hAnsi="Times New Roman" w:cs="Times New Roman"/>
+          <w:sz w:val="24"/>
+          <w:szCs w:val="24"/>
+        </w:rPr>
+      </w:pPr>
+      <w:r>
+        <w:rPr>
+          <w:rFonts w:ascii="Times New Roman" w:hAnsi="Times New Roman" w:cs="Times New Roman"/>
+          <w:sz w:val="24"/>
+          <w:szCs w:val="24"/>
+        </w:rPr>
+        <w:t>● Contract Type</w:t>
+      </w:r>
+    </w:p>
+    <w:p>
+      <w:pPr>
+        <w:spacing w:after="420" w:line="240" w:lineRule="auto"/>
+        <w:ind w:left="515" w:hanging="10"/>
+        <w:rPr>
+          <w:rFonts w:ascii="Times New Roman" w:hAnsi="Times New Roman" w:cs="Times New Roman"/>
+          <w:sz w:val="24"/>
+          <w:szCs w:val="24"/>
+        </w:rPr>
+      </w:pPr>
+      <w:r>
+        <w:rPr>
+          <w:rFonts w:ascii="Times New Roman" w:hAnsi="Times New Roman" w:cs="Times New Roman"/>
+          <w:sz w:val="24"/>
+          <w:szCs w:val="24"/>
+        </w:rPr>
+        <w:t>● Internet Service</w:t>
+      </w:r>
+    </w:p>
+    <w:p>
+      <w:pPr>
+        <w:spacing w:after="420" w:line="240" w:lineRule="auto"/>
+        <w:ind w:left="515" w:hanging="10"/>
+        <w:rPr>
+          <w:rFonts w:ascii="Times New Roman" w:hAnsi="Times New Roman" w:cs="Times New Roman"/>
+          <w:sz w:val="24"/>
+          <w:szCs w:val="24"/>
+        </w:rPr>
+      </w:pPr>
+      <w:r>
+        <w:rPr>
+          <w:rFonts w:ascii="Times New Roman" w:hAnsi="Times New Roman" w:cs="Times New Roman"/>
+          <w:sz w:val="24"/>
+          <w:szCs w:val="24"/>
+        </w:rPr>
+        <w:t>● Payment Method</w:t>
+      </w:r>
+    </w:p>
+    <w:p>
+      <w:pPr>
+        <w:spacing w:after="420" w:line="240" w:lineRule="auto"/>
+        <w:ind w:left="515" w:hanging="10"/>
+        <w:rPr>
+          <w:rFonts w:ascii="Times New Roman" w:hAnsi="Times New Roman" w:cs="Times New Roman"/>
+          <w:sz w:val="24"/>
+          <w:szCs w:val="24"/>
+        </w:rPr>
+      </w:pPr>
+      <w:r>
+        <w:rPr>
+          <w:rFonts w:ascii="Times New Roman" w:hAnsi="Times New Roman" w:cs="Times New Roman"/>
+          <w:sz w:val="24"/>
+          <w:szCs w:val="24"/>
+        </w:rPr>
+        <w:t>● Senior Citizen</w:t>
+      </w:r>
+    </w:p>
+    <w:p>
+      <w:pPr>
+        <w:spacing w:after="420" w:line="240" w:lineRule="auto"/>
+        <w:ind w:left="515" w:hanging="10"/>
+        <w:rPr>
+          <w:rFonts w:ascii="Times New Roman" w:hAnsi="Times New Roman" w:cs="Times New Roman"/>
+          <w:sz w:val="24"/>
+          <w:szCs w:val="24"/>
+        </w:rPr>
+      </w:pPr>
+      <w:r>
+        <w:rPr>
+          <w:rFonts w:ascii="Times New Roman" w:hAnsi="Times New Roman" w:cs="Times New Roman"/>
+          <w:sz w:val="24"/>
+          <w:szCs w:val="24"/>
+        </w:rPr>
+        <w:t>● Gender</w:t>
+      </w:r>
+    </w:p>
+    <w:p>
+      <w:pPr>
+        <w:spacing w:after="420" w:line="240" w:lineRule="auto"/>
+        <w:ind w:left="515" w:hanging="10"/>
+        <w:rPr>
+          <w:rFonts w:ascii="Times New Roman" w:hAnsi="Times New Roman" w:cs="Times New Roman"/>
+          <w:sz w:val="24"/>
+          <w:szCs w:val="24"/>
+        </w:rPr>
+      </w:pPr>
+      <w:r>
+        <w:rPr>
+          <w:rFonts w:ascii="Times New Roman" w:hAnsi="Times New Roman" w:cs="Times New Roman"/>
+          <w:sz w:val="24"/>
+          <w:szCs w:val="24"/>
+        </w:rPr>
+        <w:t>● Churn Status</w:t>
+      </w:r>
+    </w:p>
+    <w:p>
+      <w:pPr>
+        <w:spacing w:after="420" w:line="240" w:lineRule="auto"/>
+        <w:ind w:left="515" w:hanging="10"/>
+        <w:rPr>
+          <w:rFonts w:ascii="Times New Roman" w:hAnsi="Times New Roman" w:cs="Times New Roman"/>
+          <w:sz w:val="24"/>
+          <w:szCs w:val="24"/>
+        </w:rPr>
+      </w:pPr>
+      <w:r>
+        <w:rPr>
+          <w:rFonts w:ascii="Times New Roman" w:hAnsi="Times New Roman" w:cs="Times New Roman"/>
+          <w:sz w:val="24"/>
+          <w:szCs w:val="24"/>
+        </w:rPr>
+        <w:t>to understand how they affect customer churn in the telecom industry.</w:t>
+      </w:r>
+    </w:p>
+    <w:p>
+      <w:pPr>
+        <w:spacing w:after="420" w:line="240" w:lineRule="auto"/>
+        <w:ind w:left="515" w:hanging="10"/>
+        <w:jc w:val="center"/>
+        <w:rPr>
+          <w:rFonts w:ascii="Times New Roman" w:hAnsi="Times New Roman" w:cs="Times New Roman"/>
+          <w:sz w:val="24"/>
+          <w:szCs w:val="24"/>
+        </w:rPr>
+      </w:pPr>
+      <w:r>
+        <w:rPr>
+          <w:rFonts w:ascii="Times New Roman" w:hAnsi="Times New Roman" w:cs="Times New Roman"/>
+          <w:sz w:val="24"/>
+          <w:szCs w:val="24"/>
+        </w:rPr>
+        <w:t>---</w:t>
+      </w:r>
+    </w:p>
+    <w:p>
+      <w:pPr>
+        <w:spacing w:after="420" w:line="240" w:lineRule="auto"/>
+        <w:ind w:left="515" w:hanging="10"/>
+        <w:jc w:val="center"/>
+        <w:rPr>
+          <w:rFonts w:ascii="Times New Roman" w:hAnsi="Times New Roman" w:cs="Times New Roman"/>
+          <w:b/>
+          <w:bCs/>
+          <w:sz w:val="24"/>
+          <w:szCs w:val="24"/>
+        </w:rPr>
+      </w:pPr>
+      <w:r>
+        <w:rPr>
+          <w:rFonts w:ascii="Times New Roman" w:hAnsi="Times New Roman" w:cs="Times New Roman"/>
+          <w:b/>
+          <w:bCs/>
+          <w:sz w:val="24"/>
+          <w:szCs w:val="24"/>
+        </w:rPr>
+        <w:t>2.6 Chapter Summary</w:t>
+      </w:r>
+    </w:p>
+    <w:p>
+      <w:pPr>
+        <w:spacing w:after="420" w:line="240" w:lineRule="auto"/>
+        <w:ind w:left="515" w:hanging="10"/>
+        <w:rPr>
+          <w:rFonts w:ascii="Times New Roman" w:hAnsi="Times New Roman" w:cs="Times New Roman"/>
+          <w:sz w:val="24"/>
+          <w:szCs w:val="24"/>
+        </w:rPr>
+      </w:pPr>
+      <w:r>
+        <w:rPr>
+          <w:rFonts w:ascii="Times New Roman" w:hAnsi="Times New Roman" w:cs="Times New Roman"/>
+          <w:sz w:val="24"/>
+          <w:szCs w:val="24"/>
+        </w:rPr>
+        <w:t>This chapter explained the purpose and objectives and scope and importance of the study on customer churn in the telecom industry.</w:t>
+      </w:r>
+    </w:p>
+    <w:p>
+      <w:pPr>
+        <w:spacing w:after="420" w:line="240" w:lineRule="auto"/>
+        <w:ind w:left="515" w:hanging="10"/>
+        <w:rPr>
+          <w:rFonts w:ascii="Times New Roman" w:hAnsi="Times New Roman" w:cs="Times New Roman"/>
+          <w:sz w:val="24"/>
+          <w:szCs w:val="24"/>
+        </w:rPr>
+      </w:pPr>
+      <w:r>
+        <w:rPr>
+          <w:rFonts w:ascii="Times New Roman" w:hAnsi="Times New Roman" w:cs="Times New Roman"/>
+          <w:sz w:val="24"/>
+          <w:szCs w:val="24"/>
+        </w:rPr>
+        <w:t>It also talked about the need for customer churn analysis in the telecom industry.</w:t>
+      </w:r>
+    </w:p>
+    <w:p>
+      <w:pPr>
+        <w:spacing w:after="420" w:line="240" w:lineRule="auto"/>
+        <w:ind w:left="515" w:hanging="10"/>
+        <w:rPr>
+          <w:rFonts w:ascii="Times New Roman" w:hAnsi="Times New Roman" w:cs="Times New Roman"/>
+          <w:sz w:val="24"/>
+          <w:szCs w:val="24"/>
+        </w:rPr>
+      </w:pPr>
+      <w:r>
+        <w:rPr>
+          <w:rFonts w:ascii="Times New Roman" w:hAnsi="Times New Roman" w:cs="Times New Roman"/>
+          <w:sz w:val="24"/>
+          <w:szCs w:val="24"/>
+        </w:rPr>
+        <w:t>Described the variables used in the project on customer churn, in the telecom industry.</w:t>
+      </w:r>
+    </w:p>
+    <w:p>
+      <w:pPr>
+        <w:spacing w:after="420" w:line="240" w:lineRule="auto"/>
+        <w:ind w:left="515" w:hanging="10"/>
+        <w:rPr>
+          <w:rFonts w:ascii="Times New Roman" w:hAnsi="Times New Roman" w:cs="Times New Roman"/>
+          <w:sz w:val="24"/>
+          <w:szCs w:val="24"/>
+        </w:rPr>
+      </w:pPr>
+      <w:r>
+        <w:rPr>
+          <w:rFonts w:ascii="Times New Roman" w:hAnsi="Times New Roman" w:cs="Times New Roman"/>
+          <w:sz w:val="24"/>
+          <w:szCs w:val="24"/>
+        </w:rPr>
+        <w:t>The next chapter will focus on what other people have found out about customer churn prediction and business analytics in the telecom industry.</w:t>
+      </w:r>
     </w:p>
     <w:sectPr>
       <w:pgSz w:w="11900" w:h="16840"/>
@@ -2660,6 +5766,29 @@
       <w:sz w:val="28"/>
     </w:rPr>
   </w:style>
+  <w:style w:type="paragraph" w:styleId="Heading2">
+    <w:name w:val="heading 2"/>
+    <w:basedOn w:val="Normal"/>
+    <w:next w:val="Normal"/>
+    <w:link w:val="Heading2Char"/>
+    <w:uiPriority w:val="9"/>
+    <w:semiHidden/>
+    <w:unhideWhenUsed/>
+    <w:qFormat/>
+    <w:rsid w:val="0082110D"/>
+    <w:pPr>
+      <w:keepNext/>
+      <w:keepLines/>
+      <w:spacing w:before="40" w:after="0"/>
+      <w:outlineLvl w:val="1"/>
+    </w:pPr>
+    <w:rPr>
+      <w:rFonts w:asciiTheme="majorHAnsi" w:eastAsiaTheme="majorEastAsia" w:hAnsiTheme="majorHAnsi" w:cstheme="majorBidi"/>
+      <w:color w:val="2F5496" w:themeColor="accent1" w:themeShade="BF"/>
+      <w:sz w:val="26"/>
+      <w:szCs w:val="23"/>
+    </w:rPr>
+  </w:style>
   <w:style w:type="character" w:default="1" w:styleId="DefaultParagraphFont">
     <w:name w:val="Default Paragraph Font"/>
     <w:uiPriority w:val="1"/>
@@ -2714,6 +5843,34 @@
         <w:insideV w:val="single" w:sz="4" w:space="0" w:color="auto"/>
       </w:tblBorders>
     </w:tblPr>
+  </w:style>
+  <w:style w:type="character" w:customStyle="1" w:styleId="Heading2Char">
+    <w:name w:val="Heading 2 Char"/>
+    <w:basedOn w:val="DefaultParagraphFont"/>
+    <w:link w:val="Heading2"/>
+    <w:uiPriority w:val="9"/>
+    <w:semiHidden/>
+    <w:rsid w:val="0082110D"/>
+    <w:rPr>
+      <w:rFonts w:asciiTheme="majorHAnsi" w:eastAsiaTheme="majorEastAsia" w:hAnsiTheme="majorHAnsi" w:cstheme="majorBidi"/>
+      <w:color w:val="2F5496" w:themeColor="accent1" w:themeShade="BF"/>
+      <w:sz w:val="26"/>
+      <w:szCs w:val="23"/>
+    </w:rPr>
+  </w:style>
+  <w:style w:type="paragraph" w:styleId="ListParagraph">
+    <w:name w:val="List Paragraph"/>
+    <w:basedOn w:val="Normal"/>
+    <w:uiPriority w:val="34"/>
+    <w:qFormat/>
+    <w:rsid w:val="004C5847"/>
+    <w:pPr>
+      <w:ind w:left="720"/>
+      <w:contextualSpacing/>
+    </w:pPr>
+    <w:rPr>
+      <w:rFonts w:cs="Mangal"/>
+    </w:rPr>
   </w:style>
 </w:styles>
 </file>
@@ -3011,4 +6168,16 @@
     </a:ext>
   </a:extLst>
 </a:theme>
+</file>
+
+<file path=customXml/item1.xml><?xml version="1.0" encoding="utf-8"?>
+<b:Sources xmlns:b="http://schemas.openxmlformats.org/officeDocument/2006/bibliography" xmlns="http://schemas.openxmlformats.org/officeDocument/2006/bibliography" SelectedStyle="\APASixthEditionOfficeOnline.xsl" StyleName="APA" Version="6"/>
+</file>
+
+<file path=customXml/itemProps1.xml><?xml version="1.0" encoding="utf-8"?>
+<ds:datastoreItem xmlns:ds="http://schemas.openxmlformats.org/officeDocument/2006/customXml" ds:itemID="{CB92B31D-1F7C-4AE8-962E-1B15758633D3}">
+  <ds:schemaRefs>
+    <ds:schemaRef ds:uri="http://schemas.openxmlformats.org/officeDocument/2006/bibliography"/>
+  </ds:schemaRefs>
+</ds:datastoreItem>
 </file>
</xml_diff>